<commit_message>
Embed product screenshots into the Word handover document
Replace the eight UI screenshot placeholders in the .docx with the real
captured screenshots as framed, captioned figures (landing page, detailed
analysis, question bank, diagnostic report, admin dashboard, skills knowledge
graph, cohort analytics, database manager). Terminal/code/file-tree markers
remain as capture callouts since those visuals aren't captured.

Co-Authored-By: Claude Opus 4.8 <noreply@anthropic.com>
</commit_message>
<xml_diff>
--- a/docs/Zarban-Technical-Handover.docx
+++ b/docs/Zarban-Technical-Handover.docx
@@ -129,7 +129,7 @@
         </w:rPr>
         <w:t xml:space="preserve">Live system:  </w:t>
       </w:r>
-      <w:hyperlink w:history="1" r:id="rIdturzlgamqzbicooroerta">
+      <w:hyperlink w:history="1" r:id="rIduzsjguy4t7l32hjwnokoq">
         <w:r>
           <w:rPr>
             <w:color w:val="4F46E5"/>
@@ -153,7 +153,7 @@
         </w:rPr>
         <w:t xml:space="preserve">Repository:  </w:t>
       </w:r>
-      <w:hyperlink w:history="1" r:id="rIdjiff307mx0__tg8takuso">
+      <w:hyperlink w:history="1" r:id="rIdghxkeeyfcq024-s1huau7">
         <w:r>
           <w:rPr>
             <w:color w:val="4F46E5"/>
@@ -369,6 +369,97 @@
       </w:r>
       <w:r>
         <w:t xml:space="preserve">manages the question bank, curriculum, staff accounts, system health, and — via a bespoke Database manager — the entire database.</w:t>
+      </w:r>
+    </w:p>
+    <w:tbl>
+      <w:tblPr>
+        <w:tblW w:type="dxa" w:w="9026"/>
+        <w:tblBorders>
+          <w:top w:val="single" w:color="D9DCEA" w:sz="4"/>
+          <w:left w:val="single" w:color="D9DCEA" w:sz="4"/>
+          <w:bottom w:val="single" w:color="D9DCEA" w:sz="4"/>
+          <w:right w:val="single" w:color="D9DCEA" w:sz="4"/>
+          <w:insideH w:val="single" w:color="D9DCEA" w:sz="4"/>
+          <w:insideV w:val="single" w:color="D9DCEA" w:sz="4"/>
+        </w:tblBorders>
+      </w:tblPr>
+      <w:tblGrid>
+        <w:gridCol w:w="9026"/>
+      </w:tblGrid>
+      <w:tr>
+        <w:tc>
+          <w:tcPr>
+            <w:tcW w:type="dxa" w:w="9026"/>
+            <w:tcMar>
+              <w:top w:type="dxa" w:w="60"/>
+              <w:left w:type="dxa" w:w="60"/>
+              <w:bottom w:type="dxa" w:w="60"/>
+              <w:right w:type="dxa" w:w="60"/>
+            </w:tcMar>
+          </w:tcPr>
+          <w:p>
+            <w:pPr>
+              <w:spacing w:after="0"/>
+              <w:jc w:val="center"/>
+            </w:pPr>
+            <w:r>
+              <w:drawing>
+                <wp:inline distT="0" distB="0" distL="0" distR="0">
+                  <wp:extent cx="5600700" cy="3505200"/>
+                  <wp:effectExtent t="0" r="0" b="0" l="0"/>
+                  <wp:docPr id="1" name="" descr="" title=""/>
+                  <wp:cNvGraphicFramePr>
+                    <a:graphicFrameLocks xmlns:a="http://schemas.openxmlformats.org/drawingml/2006/main" noChangeAspect="1"/>
+                  </wp:cNvGraphicFramePr>
+                  <a:graphic xmlns:a="http://schemas.openxmlformats.org/drawingml/2006/main">
+                    <a:graphicData uri="http://schemas.openxmlformats.org/drawingml/2006/picture">
+                      <pic:pic xmlns:pic="http://schemas.openxmlformats.org/drawingml/2006/picture">
+                        <pic:nvPicPr>
+                          <pic:cNvPr id="0" name="" descr=""/>
+                          <pic:cNvPicPr>
+                            <a:picLocks noChangeAspect="1" noChangeArrowheads="1"/>
+                          </pic:cNvPicPr>
+                        </pic:nvPicPr>
+                        <pic:blipFill>
+                          <a:blip r:embed="rId7" cstate="none"/>
+                          <a:srcRect/>
+                          <a:stretch>
+                            <a:fillRect/>
+                          </a:stretch>
+                        </pic:blipFill>
+                        <pic:spPr bwMode="auto">
+                          <a:xfrm>
+                            <a:off x="0" y="0"/>
+                            <a:ext cx="5600700" cy="3505200"/>
+                          </a:xfrm>
+                          <a:prstGeom prst="rect">
+                            <a:avLst/>
+                          </a:prstGeom>
+                        </pic:spPr>
+                      </pic:pic>
+                    </a:graphicData>
+                  </a:graphic>
+                </wp:inline>
+              </w:drawing>
+            </w:r>
+          </w:p>
+        </w:tc>
+      </w:tr>
+    </w:tbl>
+    <w:p>
+      <w:pPr>
+        <w:spacing w:after="200" w:before="40"/>
+        <w:jc w:val="center"/>
+      </w:pPr>
+      <w:r>
+        <w:rPr>
+          <w:i/>
+          <w:iCs/>
+          <w:color w:val="5A6178"/>
+          <w:sz w:val="18"/>
+          <w:szCs w:val="18"/>
+        </w:rPr>
+        <w:t xml:space="preserve">Figure 1 — The student landing page (/), with the assessment start card and class 5–10 selector.</w:t>
       </w:r>
     </w:p>
     <w:p>
@@ -1329,60 +1420,6 @@
         <w:t xml:space="preserve">Wrote the end-to-end test harness.</w:t>
       </w:r>
     </w:p>
-    <w:tbl>
-      <w:tblPr>
-        <w:tblW w:type="dxa" w:w="9026"/>
-        <w:tblBorders>
-          <w:top w:val="none" w:color="FFFFFF" w:sz="0"/>
-          <w:left w:val="none" w:color="FFFFFF" w:sz="0"/>
-          <w:bottom w:val="none" w:color="FFFFFF" w:sz="0"/>
-          <w:right w:val="none" w:color="FFFFFF" w:sz="0"/>
-          <w:insideH w:val="none" w:color="FFFFFF" w:sz="0"/>
-          <w:insideV w:val="none" w:color="FFFFFF" w:sz="0"/>
-        </w:tblBorders>
-      </w:tblPr>
-      <w:tblGrid>
-        <w:gridCol w:w="9026"/>
-      </w:tblGrid>
-      <w:tr>
-        <w:tc>
-          <w:tcPr>
-            <w:tcW w:type="dxa" w:w="9026"/>
-            <w:shd w:fill="E9FBF0" w:val="clear"/>
-            <w:tcMar>
-              <w:top w:type="dxa" w:w="90"/>
-              <w:left w:type="dxa" w:w="160"/>
-              <w:bottom w:type="dxa" w:w="90"/>
-              <w:right w:type="dxa" w:w="160"/>
-            </w:tcMar>
-          </w:tcPr>
-          <w:p>
-            <w:pPr>
-              <w:spacing w:after="0" w:line="264"/>
-            </w:pPr>
-            <w:r>
-              <w:rPr>
-                <w:b/>
-                <w:bCs/>
-                <w:caps/>
-                <w:color w:val="047857"/>
-                <w:sz w:val="18"/>
-                <w:szCs w:val="18"/>
-              </w:rPr>
-              <w:t xml:space="preserve">📷 Insert screenshot — Landing page  </w:t>
-            </w:r>
-            <w:r>
-              <w:rPr>
-                <w:color w:val="1B2138"/>
-                <w:sz w:val="20"/>
-                <w:szCs w:val="20"/>
-              </w:rPr>
-              <w:t xml:space="preserve">The student landing page (/), showing the hero “Find out exactly where your math stands” and the “Start your assessment” card with the class 5–10 selector.</w:t>
-            </w:r>
-          </w:p>
-        </w:tc>
-      </w:tr>
-    </w:tbl>
     <w:p>
       <w:r>
         <w:br w:type="page"/>
@@ -1806,7 +1843,7 @@
                 <w:sz w:val="18"/>
                 <w:szCs w:val="18"/>
               </w:rPr>
-              <w:t xml:space="preserve">📷 Insert screenshot — Repo file tree  </w:t>
+              <w:t xml:space="preserve">📷 Capture — Repo file tree  </w:t>
             </w:r>
             <w:r>
               <w:rPr>
@@ -1977,7 +2014,7 @@
         <w:t xml:space="preserve">@@index([gradeLevel, difficultyBand])</w:t>
       </w:r>
       <w:r>
-        <w:t xml:space="preserve"> — these back the fetcher’s exact-cell and fallback lookups; </w:t>
+        <w:t xml:space="preserve">; </w:t>
       </w:r>
       <w:r>
         <w:rPr>
@@ -2086,7 +2123,7 @@
         <w:t xml:space="preserve">.wrangler/state/v3/d1/miniflare-D1DatabaseObject/*.sqlite</w:t>
       </w:r>
       <w:r>
-        <w:t xml:space="preserve"> via a node:sqlite script (so npm run dev sees the new schema).</w:t>
+        <w:t xml:space="preserve"> via a node:sqlite script.</w:t>
       </w:r>
     </w:p>
     <w:p>
@@ -2196,7 +2233,7 @@
                 <w:sz w:val="20"/>
                 <w:szCs w:val="20"/>
               </w:rPr>
-              <w:t xml:space="preserve">Running raw SQL through node -e mangles double-quoted SQL identifiers into JS strings. Fix: all ad-hoc SQL runs via heredoc .mjs files with single-quoted SQL, never inline node -e.</w:t>
+              <w:t xml:space="preserve">Running raw SQL through node -e mangles double-quoted SQL identifiers into JS strings. Fix: all ad-hoc SQL runs via heredoc .mjs files with single-quoted SQL.</w:t>
             </w:r>
           </w:p>
         </w:tc>
@@ -2242,7 +2279,7 @@
                 <w:sz w:val="18"/>
                 <w:szCs w:val="18"/>
               </w:rPr>
-              <w:t xml:space="preserve">📷 Insert screenshot — prisma/schema.prisma  </w:t>
+              <w:t xml:space="preserve">📷 Capture — prisma/schema.prisma  </w:t>
             </w:r>
             <w:r>
               <w:rPr>
@@ -2296,7 +2333,7 @@
                 <w:sz w:val="18"/>
                 <w:szCs w:val="18"/>
               </w:rPr>
-              <w:t xml:space="preserve">🎥 Insert screen recording — The migration pipeline  </w:t>
+              <w:t xml:space="preserve">🎥 Screen recording — The migration pipeline  </w:t>
             </w:r>
             <w:r>
               <w:rPr>
@@ -2304,7 +2341,7 @@
                 <w:sz w:val="20"/>
                 <w:szCs w:val="20"/>
               </w:rPr>
-              <w:t xml:space="preserve">Terminal running db:push → the sqlite-apply script → export-d1-migration.py, ending with git diff of the regenerated migration. ~40s. Proves the pipeline is deterministic.</w:t>
+              <w:t xml:space="preserve">Terminal running db:push → the sqlite-apply script → export-d1-migration.py, ending with git diff of the regenerated migration. ~40s.</w:t>
             </w:r>
           </w:p>
         </w:tc>
@@ -2850,6 +2887,97 @@
       <w:tblPr>
         <w:tblW w:type="dxa" w:w="9026"/>
         <w:tblBorders>
+          <w:top w:val="single" w:color="D9DCEA" w:sz="4"/>
+          <w:left w:val="single" w:color="D9DCEA" w:sz="4"/>
+          <w:bottom w:val="single" w:color="D9DCEA" w:sz="4"/>
+          <w:right w:val="single" w:color="D9DCEA" w:sz="4"/>
+          <w:insideH w:val="single" w:color="D9DCEA" w:sz="4"/>
+          <w:insideV w:val="single" w:color="D9DCEA" w:sz="4"/>
+        </w:tblBorders>
+      </w:tblPr>
+      <w:tblGrid>
+        <w:gridCol w:w="9026"/>
+      </w:tblGrid>
+      <w:tr>
+        <w:tc>
+          <w:tcPr>
+            <w:tcW w:type="dxa" w:w="9026"/>
+            <w:tcMar>
+              <w:top w:type="dxa" w:w="60"/>
+              <w:left w:type="dxa" w:w="60"/>
+              <w:bottom w:type="dxa" w:w="60"/>
+              <w:right w:type="dxa" w:w="60"/>
+            </w:tcMar>
+          </w:tcPr>
+          <w:p>
+            <w:pPr>
+              <w:spacing w:after="0"/>
+              <w:jc w:val="center"/>
+            </w:pPr>
+            <w:r>
+              <w:drawing>
+                <wp:inline distT="0" distB="0" distL="0" distR="0">
+                  <wp:extent cx="5600700" cy="5133975"/>
+                  <wp:effectExtent t="0" r="0" b="0" l="0"/>
+                  <wp:docPr id="1" name="" descr="" title=""/>
+                  <wp:cNvGraphicFramePr>
+                    <a:graphicFrameLocks xmlns:a="http://schemas.openxmlformats.org/drawingml/2006/main" noChangeAspect="1"/>
+                  </wp:cNvGraphicFramePr>
+                  <a:graphic xmlns:a="http://schemas.openxmlformats.org/drawingml/2006/main">
+                    <a:graphicData uri="http://schemas.openxmlformats.org/drawingml/2006/picture">
+                      <pic:pic xmlns:pic="http://schemas.openxmlformats.org/drawingml/2006/picture">
+                        <pic:nvPicPr>
+                          <pic:cNvPr id="0" name="" descr=""/>
+                          <pic:cNvPicPr>
+                            <a:picLocks noChangeAspect="1" noChangeArrowheads="1"/>
+                          </pic:cNvPicPr>
+                        </pic:nvPicPr>
+                        <pic:blipFill>
+                          <a:blip r:embed="rId8" cstate="none"/>
+                          <a:srcRect/>
+                          <a:stretch>
+                            <a:fillRect/>
+                          </a:stretch>
+                        </pic:blipFill>
+                        <pic:spPr bwMode="auto">
+                          <a:xfrm>
+                            <a:off x="0" y="0"/>
+                            <a:ext cx="5600700" cy="5133975"/>
+                          </a:xfrm>
+                          <a:prstGeom prst="rect">
+                            <a:avLst/>
+                          </a:prstGeom>
+                        </pic:spPr>
+                      </pic:pic>
+                    </a:graphicData>
+                  </a:graphic>
+                </wp:inline>
+              </w:drawing>
+            </w:r>
+          </w:p>
+        </w:tc>
+      </w:tr>
+    </w:tbl>
+    <w:p>
+      <w:pPr>
+        <w:spacing w:after="200" w:before="40"/>
+        <w:jc w:val="center"/>
+      </w:pPr>
+      <w:r>
+        <w:rPr>
+          <w:i/>
+          <w:iCs/>
+          <w:color w:val="5A6178"/>
+          <w:sz w:val="18"/>
+          <w:szCs w:val="18"/>
+        </w:rPr>
+        <w:t xml:space="preserve">Figure 2 — Detailed analysis (/report/&lt;id&gt;/analysis): the θ ability journey, the adaptive-path grid (with twin-probe, lucky-guess and rushed markers), and time per question.</w:t>
+      </w:r>
+    </w:p>
+    <w:tbl>
+      <w:tblPr>
+        <w:tblW w:type="dxa" w:w="9026"/>
+        <w:tblBorders>
           <w:top w:val="none" w:color="FFFFFF" w:sz="0"/>
           <w:left w:val="none" w:color="FFFFFF" w:sz="0"/>
           <w:bottom w:val="none" w:color="FFFFFF" w:sz="0"/>
@@ -2886,7 +3014,7 @@
                 <w:sz w:val="18"/>
                 <w:szCs w:val="18"/>
               </w:rPr>
-              <w:t xml:space="preserve">🎥 Insert screen recording — The adaptive path  </w:t>
+              <w:t xml:space="preserve">🎥 Screen recording — The adaptive path  </w:t>
             </w:r>
             <w:r>
               <w:rPr>
@@ -2894,7 +3022,493 @@
                 <w:sz w:val="20"/>
                 <w:szCs w:val="20"/>
               </w:rPr>
-              <w:t xml:space="preserve">Open /report/&lt;id&gt;/analysis. Pan the “Adaptive Path” grid while narrating one escalation (streak → harder) and one regression (fail streak → prerequisite, one grade down). The single best proof the engine is genuinely adaptive, not random.</w:t>
+              <w:t xml:space="preserve">Pan the “Adaptive Path” grid while narrating one escalation (streak → harder) and one regression (fail streak → prerequisite, one grade down). The single best proof the engine is genuinely adaptive.</w:t>
+            </w:r>
+          </w:p>
+        </w:tc>
+      </w:tr>
+    </w:tbl>
+    <w:p>
+      <w:r>
+        <w:br w:type="page"/>
+      </w:r>
+    </w:p>
+    <w:p>
+      <w:pPr>
+        <w:pStyle w:val="Heading1"/>
+        <w:spacing w:after="140" w:before="320"/>
+      </w:pPr>
+      <w:r>
+        <w:rPr>
+          <w:b/>
+          <w:bCs/>
+          <w:color w:val="4F46E5"/>
+          <w:sz w:val="30"/>
+          <w:szCs w:val="30"/>
+        </w:rPr>
+        <w:t xml:space="preserve">Phase 3 — The Question Bank (Generation &amp; QA Gate)</w:t>
+      </w:r>
+    </w:p>
+    <w:tbl>
+      <w:tblPr>
+        <w:tblW w:type="dxa" w:w="9026"/>
+        <w:tblBorders>
+          <w:top w:val="none" w:color="FFFFFF" w:sz="0"/>
+          <w:left w:val="none" w:color="FFFFFF" w:sz="0"/>
+          <w:bottom w:val="none" w:color="FFFFFF" w:sz="0"/>
+          <w:right w:val="none" w:color="FFFFFF" w:sz="0"/>
+          <w:insideH w:val="none" w:color="FFFFFF" w:sz="0"/>
+          <w:insideV w:val="none" w:color="FFFFFF" w:sz="0"/>
+        </w:tblBorders>
+      </w:tblPr>
+      <w:tblGrid>
+        <w:gridCol w:w="9026"/>
+      </w:tblGrid>
+      <w:tr>
+        <w:tc>
+          <w:tcPr>
+            <w:tcW w:type="dxa" w:w="9026"/>
+            <w:shd w:fill="EEF0FE" w:val="clear"/>
+            <w:tcMar>
+              <w:top w:type="dxa" w:w="90"/>
+              <w:left w:type="dxa" w:w="160"/>
+              <w:bottom w:type="dxa" w:w="90"/>
+              <w:right w:type="dxa" w:w="160"/>
+            </w:tcMar>
+          </w:tcPr>
+          <w:p>
+            <w:pPr>
+              <w:spacing w:after="0" w:line="264"/>
+            </w:pPr>
+            <w:r>
+              <w:rPr>
+                <w:b/>
+                <w:bCs/>
+                <w:caps/>
+                <w:color w:val="7C3AED"/>
+                <w:sz w:val="18"/>
+                <w:szCs w:val="18"/>
+              </w:rPr>
+              <w:t xml:space="preserve">Reasoning  </w:t>
+            </w:r>
+            <w:r>
+              <w:rPr>
+                <w:color w:val="1B2138"/>
+                <w:sz w:val="20"/>
+                <w:szCs w:val="20"/>
+              </w:rPr>
+              <w:t xml:space="preserve">A credible diagnostic needs hundreds of calibrated, trap-annotated items. Hand-authoring is infeasible; a parametric generator with an automated quality gate was built instead.</w:t>
+            </w:r>
+          </w:p>
+        </w:tc>
+      </w:tr>
+    </w:tbl>
+    <w:p>
+      <w:pPr>
+        <w:spacing w:after="60"/>
+      </w:pPr>
+      <w:r>
+        <w:rPr>
+          <w:sz w:val="8"/>
+          <w:szCs w:val="8"/>
+        </w:rPr>
+        <w:t xml:space="preserve"/>
+      </w:r>
+    </w:p>
+    <w:p>
+      <w:pPr>
+        <w:pStyle w:val="ListParagraph"/>
+        <w:numPr>
+          <w:ilvl w:val="0"/>
+          <w:numId w:val="2"/>
+        </w:numPr>
+        <w:spacing w:after="60" w:line="264"/>
+      </w:pPr>
+      <w:r>
+        <w:rPr>
+          <w:rFonts w:ascii="Consolas" w:cs="Consolas" w:eastAsia="Consolas" w:hAnsi="Consolas"/>
+          <w:color w:val="334155"/>
+          <w:sz w:val="19"/>
+          <w:szCs w:val="19"/>
+        </w:rPr>
+        <w:t xml:space="preserve">scripts/generate-workbook.ts</w:t>
+      </w:r>
+      <w:r>
+        <w:t xml:space="preserve"> + </w:t>
+      </w:r>
+      <w:r>
+        <w:rPr>
+          <w:rFonts w:ascii="Consolas" w:cs="Consolas" w:eastAsia="Consolas" w:hAnsi="Consolas"/>
+          <w:color w:val="334155"/>
+          <w:sz w:val="19"/>
+          <w:szCs w:val="19"/>
+        </w:rPr>
+        <w:t xml:space="preserve">scripts/workbook/builders.ts</w:t>
+      </w:r>
+      <w:r>
+        <w:t xml:space="preserve"> — parametric templates emit questions per {skill, grade, band} with IRT parameters, distractors and traps; a PLAN controls counts per band, a retry budget guarantees coverage.</w:t>
+      </w:r>
+    </w:p>
+    <w:p>
+      <w:pPr>
+        <w:pStyle w:val="ListParagraph"/>
+        <w:numPr>
+          <w:ilvl w:val="0"/>
+          <w:numId w:val="2"/>
+        </w:numPr>
+        <w:spacing w:after="60" w:line="264"/>
+      </w:pPr>
+      <w:r>
+        <w:rPr>
+          <w:rFonts w:ascii="Consolas" w:cs="Consolas" w:eastAsia="Consolas" w:hAnsi="Consolas"/>
+          <w:color w:val="334155"/>
+          <w:sz w:val="19"/>
+          <w:szCs w:val="19"/>
+        </w:rPr>
+        <w:t xml:space="preserve">scripts/verify-workbook.ts</w:t>
+      </w:r>
+      <w:r>
+        <w:t xml:space="preserve"> — the QA gate: rejects the workbook if any item lacks a correct option, traps, or valid IRT params.</w:t>
+      </w:r>
+    </w:p>
+    <w:p>
+      <w:pPr>
+        <w:pStyle w:val="ListParagraph"/>
+        <w:numPr>
+          <w:ilvl w:val="0"/>
+          <w:numId w:val="2"/>
+        </w:numPr>
+        <w:spacing w:after="60" w:line="264"/>
+      </w:pPr>
+      <w:r>
+        <w:rPr>
+          <w:rFonts w:ascii="Consolas" w:cs="Consolas" w:eastAsia="Consolas" w:hAnsi="Consolas"/>
+          <w:color w:val="334155"/>
+          <w:sz w:val="19"/>
+          <w:szCs w:val="19"/>
+        </w:rPr>
+        <w:t xml:space="preserve">scripts/seed-devdb.ts</w:t>
+      </w:r>
+      <w:r>
+        <w:t xml:space="preserve"> + </w:t>
+      </w:r>
+      <w:r>
+        <w:rPr>
+          <w:rFonts w:ascii="Consolas" w:cs="Consolas" w:eastAsia="Consolas" w:hAnsi="Consolas"/>
+          <w:color w:val="334155"/>
+          <w:sz w:val="19"/>
+          <w:szCs w:val="19"/>
+        </w:rPr>
+        <w:t xml:space="preserve">scripts/seed-curriculum.ts</w:t>
+      </w:r>
+      <w:r>
+        <w:t xml:space="preserve"> — load the workbook, the NCERT curriculum, staff accounts, and settings.</w:t>
+      </w:r>
+    </w:p>
+    <w:p>
+      <w:pPr>
+        <w:pStyle w:val="ListParagraph"/>
+        <w:numPr>
+          <w:ilvl w:val="0"/>
+          <w:numId w:val="2"/>
+        </w:numPr>
+        <w:spacing w:after="60" w:line="264"/>
+      </w:pPr>
+      <w:r>
+        <w:rPr>
+          <w:b/>
+          <w:bCs/>
+        </w:rPr>
+        <w:t xml:space="preserve">Output: </w:t>
+      </w:r>
+      <w:r>
+        <w:t xml:space="preserve">911 QA-passed items across the grade/skill/band matrix.</w:t>
+      </w:r>
+    </w:p>
+    <w:tbl>
+      <w:tblPr>
+        <w:tblW w:type="dxa" w:w="9026"/>
+        <w:tblBorders>
+          <w:top w:val="none" w:color="FFFFFF" w:sz="0"/>
+          <w:left w:val="none" w:color="FFFFFF" w:sz="0"/>
+          <w:bottom w:val="none" w:color="FFFFFF" w:sz="0"/>
+          <w:right w:val="none" w:color="FFFFFF" w:sz="0"/>
+          <w:insideH w:val="none" w:color="FFFFFF" w:sz="0"/>
+          <w:insideV w:val="none" w:color="FFFFFF" w:sz="0"/>
+        </w:tblBorders>
+      </w:tblPr>
+      <w:tblGrid>
+        <w:gridCol w:w="9026"/>
+      </w:tblGrid>
+      <w:tr>
+        <w:tc>
+          <w:tcPr>
+            <w:tcW w:type="dxa" w:w="9026"/>
+            <w:shd w:fill="FFF4E5" w:val="clear"/>
+            <w:tcMar>
+              <w:top w:type="dxa" w:w="90"/>
+              <w:left w:type="dxa" w:w="160"/>
+              <w:bottom w:type="dxa" w:w="90"/>
+              <w:right w:type="dxa" w:w="160"/>
+            </w:tcMar>
+          </w:tcPr>
+          <w:p>
+            <w:pPr>
+              <w:spacing w:after="0" w:line="264"/>
+            </w:pPr>
+            <w:r>
+              <w:rPr>
+                <w:b/>
+                <w:bCs/>
+                <w:caps/>
+                <w:color w:val="B45309"/>
+                <w:sz w:val="18"/>
+                <w:szCs w:val="18"/>
+              </w:rPr>
+              <w:t xml:space="preserve">⚠ Pitfall  </w:t>
+            </w:r>
+            <w:r>
+              <w:rPr>
+                <w:color w:val="1B2138"/>
+                <w:sz w:val="20"/>
+                <w:szCs w:val="20"/>
+              </w:rPr>
+              <w:t xml:space="preserve">Generation occasionally under-fills a sparse cell. Fix: the retry budget + the verify gate fail the build loudly rather than shipping thin coverage.</w:t>
+            </w:r>
+          </w:p>
+        </w:tc>
+      </w:tr>
+    </w:tbl>
+    <w:tbl>
+      <w:tblPr>
+        <w:tblW w:type="dxa" w:w="9026"/>
+        <w:tblBorders>
+          <w:top w:val="single" w:color="D9DCEA" w:sz="4"/>
+          <w:left w:val="single" w:color="D9DCEA" w:sz="4"/>
+          <w:bottom w:val="single" w:color="D9DCEA" w:sz="4"/>
+          <w:right w:val="single" w:color="D9DCEA" w:sz="4"/>
+          <w:insideH w:val="single" w:color="D9DCEA" w:sz="4"/>
+          <w:insideV w:val="single" w:color="D9DCEA" w:sz="4"/>
+        </w:tblBorders>
+      </w:tblPr>
+      <w:tblGrid>
+        <w:gridCol w:w="9026"/>
+      </w:tblGrid>
+      <w:tr>
+        <w:tc>
+          <w:tcPr>
+            <w:tcW w:type="dxa" w:w="9026"/>
+            <w:tcMar>
+              <w:top w:type="dxa" w:w="60"/>
+              <w:left w:type="dxa" w:w="60"/>
+              <w:bottom w:type="dxa" w:w="60"/>
+              <w:right w:type="dxa" w:w="60"/>
+            </w:tcMar>
+          </w:tcPr>
+          <w:p>
+            <w:pPr>
+              <w:spacing w:after="0"/>
+              <w:jc w:val="center"/>
+            </w:pPr>
+            <w:r>
+              <w:drawing>
+                <wp:inline distT="0" distB="0" distL="0" distR="0">
+                  <wp:extent cx="5600700" cy="3695700"/>
+                  <wp:effectExtent t="0" r="0" b="0" l="0"/>
+                  <wp:docPr id="1" name="" descr="" title=""/>
+                  <wp:cNvGraphicFramePr>
+                    <a:graphicFrameLocks xmlns:a="http://schemas.openxmlformats.org/drawingml/2006/main" noChangeAspect="1"/>
+                  </wp:cNvGraphicFramePr>
+                  <a:graphic xmlns:a="http://schemas.openxmlformats.org/drawingml/2006/main">
+                    <a:graphicData uri="http://schemas.openxmlformats.org/drawingml/2006/picture">
+                      <pic:pic xmlns:pic="http://schemas.openxmlformats.org/drawingml/2006/picture">
+                        <pic:nvPicPr>
+                          <pic:cNvPr id="0" name="" descr=""/>
+                          <pic:cNvPicPr>
+                            <a:picLocks noChangeAspect="1" noChangeArrowheads="1"/>
+                          </pic:cNvPicPr>
+                        </pic:nvPicPr>
+                        <pic:blipFill>
+                          <a:blip r:embed="rId9" cstate="none"/>
+                          <a:srcRect/>
+                          <a:stretch>
+                            <a:fillRect/>
+                          </a:stretch>
+                        </pic:blipFill>
+                        <pic:spPr bwMode="auto">
+                          <a:xfrm>
+                            <a:off x="0" y="0"/>
+                            <a:ext cx="5600700" cy="3695700"/>
+                          </a:xfrm>
+                          <a:prstGeom prst="rect">
+                            <a:avLst/>
+                          </a:prstGeom>
+                        </pic:spPr>
+                      </pic:pic>
+                    </a:graphicData>
+                  </a:graphic>
+                </wp:inline>
+              </w:drawing>
+            </w:r>
+          </w:p>
+        </w:tc>
+      </w:tr>
+    </w:tbl>
+    <w:p>
+      <w:pPr>
+        <w:spacing w:after="200" w:before="40"/>
+        <w:jc w:val="center"/>
+      </w:pPr>
+      <w:r>
+        <w:rPr>
+          <w:i/>
+          <w:iCs/>
+          <w:color w:val="5A6178"/>
+          <w:sz w:val="18"/>
+          <w:szCs w:val="18"/>
+        </w:rPr>
+        <w:t xml:space="preserve">Figure 3 — The question bank (/admin/questions): 900+ items with grade/skill/difficulty filters, trap counts, and inline edit / Excel import.</w:t>
+      </w:r>
+    </w:p>
+    <w:p>
+      <w:r>
+        <w:br w:type="page"/>
+      </w:r>
+    </w:p>
+    <w:p>
+      <w:pPr>
+        <w:pStyle w:val="Heading1"/>
+        <w:spacing w:after="140" w:before="320"/>
+      </w:pPr>
+      <w:r>
+        <w:rPr>
+          <w:b/>
+          <w:bCs/>
+          <w:color w:val="4F46E5"/>
+          <w:sz w:val="30"/>
+          <w:szCs w:val="30"/>
+        </w:rPr>
+        <w:t xml:space="preserve">Phase 4 — Authentication &amp; RBAC</w:t>
+      </w:r>
+    </w:p>
+    <w:p>
+      <w:pPr>
+        <w:pStyle w:val="ListParagraph"/>
+        <w:numPr>
+          <w:ilvl w:val="0"/>
+          <w:numId w:val="2"/>
+        </w:numPr>
+        <w:spacing w:after="60" w:line="264"/>
+      </w:pPr>
+      <w:r>
+        <w:rPr>
+          <w:b/>
+          <w:bCs/>
+        </w:rPr>
+        <w:t xml:space="preserve">Single login endpoint </w:t>
+      </w:r>
+      <w:r>
+        <w:rPr>
+          <w:rFonts w:ascii="Consolas" w:cs="Consolas" w:eastAsia="Consolas" w:hAnsi="Consolas"/>
+          <w:color w:val="334155"/>
+          <w:sz w:val="19"/>
+          <w:szCs w:val="19"/>
+        </w:rPr>
+        <w:t xml:space="preserve">POST /api/admin/auth/login</w:t>
+      </w:r>
+      <w:r>
+        <w:t xml:space="preserve"> → verifies with bcrypt.compareSync → signs a jose JWT → sets an HttpOnly, Secure, SameSite=Lax cookie named zarban_admin.</w:t>
+      </w:r>
+    </w:p>
+    <w:p>
+      <w:pPr>
+        <w:pStyle w:val="ListParagraph"/>
+        <w:numPr>
+          <w:ilvl w:val="0"/>
+          <w:numId w:val="2"/>
+        </w:numPr>
+        <w:spacing w:after="60" w:line="264"/>
+      </w:pPr>
+      <w:r>
+        <w:rPr>
+          <w:b/>
+          <w:bCs/>
+        </w:rPr>
+        <w:t xml:space="preserve">Role hierarchy </w:t>
+      </w:r>
+      <w:r>
+        <w:t xml:space="preserve">Admin &gt; Teacher &gt; Viewer (analytics rank) plus Editor (content). Guards requireRole(min) and requireContentRole() live in src/lib/auth.ts.</w:t>
+      </w:r>
+    </w:p>
+    <w:p>
+      <w:pPr>
+        <w:pStyle w:val="ListParagraph"/>
+        <w:numPr>
+          <w:ilvl w:val="0"/>
+          <w:numId w:val="2"/>
+        </w:numPr>
+        <w:spacing w:after="60" w:line="264"/>
+      </w:pPr>
+      <w:r>
+        <w:rPr>
+          <w:b/>
+          <w:bCs/>
+        </w:rPr>
+        <w:t xml:space="preserve">Audit </w:t>
+      </w:r>
+      <w:r>
+        <w:t xml:space="preserve">every privileged action is written to AdminAuditLog via logAudit(session, action, target, detail).</w:t>
+      </w:r>
+    </w:p>
+    <w:tbl>
+      <w:tblPr>
+        <w:tblW w:type="dxa" w:w="9026"/>
+        <w:tblBorders>
+          <w:top w:val="none" w:color="FFFFFF" w:sz="0"/>
+          <w:left w:val="none" w:color="FFFFFF" w:sz="0"/>
+          <w:bottom w:val="none" w:color="FFFFFF" w:sz="0"/>
+          <w:right w:val="none" w:color="FFFFFF" w:sz="0"/>
+          <w:insideH w:val="none" w:color="FFFFFF" w:sz="0"/>
+          <w:insideV w:val="none" w:color="FFFFFF" w:sz="0"/>
+        </w:tblBorders>
+      </w:tblPr>
+      <w:tblGrid>
+        <w:gridCol w:w="9026"/>
+      </w:tblGrid>
+      <w:tr>
+        <w:tc>
+          <w:tcPr>
+            <w:tcW w:type="dxa" w:w="9026"/>
+            <w:shd w:fill="FFF4E5" w:val="clear"/>
+            <w:tcMar>
+              <w:top w:type="dxa" w:w="90"/>
+              <w:left w:type="dxa" w:w="160"/>
+              <w:bottom w:type="dxa" w:w="90"/>
+              <w:right w:type="dxa" w:w="160"/>
+            </w:tcMar>
+          </w:tcPr>
+          <w:p>
+            <w:pPr>
+              <w:spacing w:after="0" w:line="264"/>
+            </w:pPr>
+            <w:r>
+              <w:rPr>
+                <w:b/>
+                <w:bCs/>
+                <w:caps/>
+                <w:color w:val="B45309"/>
+                <w:sz w:val="18"/>
+                <w:szCs w:val="18"/>
+              </w:rPr>
+              <w:t xml:space="preserve">⚠ Pitfall  </w:t>
+            </w:r>
+            <w:r>
+              <w:rPr>
+                <w:color w:val="1B2138"/>
+                <w:sz w:val="20"/>
+                <w:szCs w:val="20"/>
+              </w:rPr>
+              <w:t xml:space="preserve">Next.js route files may only export HTTP handlers; exporting a helper constant from a route breaks the build. Fix: shared constants (e.g. VALID_ROLES) live in src/lib/auth.ts.</w:t>
             </w:r>
           </w:p>
         </w:tc>
@@ -2919,7 +3533,7 @@
         <w:tc>
           <w:tcPr>
             <w:tcW w:type="dxa" w:w="9026"/>
-            <w:shd w:fill="E9FBF0" w:val="clear"/>
+            <w:shd w:fill="EEF0FE" w:val="clear"/>
             <w:tcMar>
               <w:top w:type="dxa" w:w="90"/>
               <w:left w:type="dxa" w:w="160"/>
@@ -2936,11 +3550,11 @@
                 <w:b/>
                 <w:bCs/>
                 <w:caps/>
-                <w:color w:val="047857"/>
+                <w:color w:val="7C3AED"/>
                 <w:sz w:val="18"/>
                 <w:szCs w:val="18"/>
               </w:rPr>
-              <w:t xml:space="preserve">📷 Insert screenshot — Ability journey chart  </w:t>
+              <w:t xml:space="preserve">Security constraint  </w:t>
             </w:r>
             <w:r>
               <w:rPr>
@@ -2948,7 +3562,7 @@
                 <w:sz w:val="20"/>
                 <w:szCs w:val="20"/>
               </w:rPr>
-              <w:t xml:space="preserve">The θ line chart on the analysis page — the running ability estimate rising and falling per question.</w:t>
+              <w:t xml:space="preserve">Credential entry, account creation, and payment are out of scope for automation by design — those are performed by a human.</w:t>
             </w:r>
           </w:p>
         </w:tc>
@@ -2972,7 +3586,316 @@
           <w:sz w:val="30"/>
           <w:szCs w:val="30"/>
         </w:rPr>
-        <w:t xml:space="preserve">Phase 3 — The Question Bank (Generation &amp; QA Gate)</w:t>
+        <w:t xml:space="preserve">Phase 5 — The Student Experience</w:t>
+      </w:r>
+    </w:p>
+    <w:p>
+      <w:pPr>
+        <w:pStyle w:val="Heading2"/>
+        <w:spacing w:after="90" w:before="220"/>
+      </w:pPr>
+      <w:r>
+        <w:rPr>
+          <w:b/>
+          <w:bCs/>
+          <w:color w:val="1B2138"/>
+          <w:sz w:val="25"/>
+          <w:szCs w:val="25"/>
+        </w:rPr>
+        <w:t xml:space="preserve">5.1 Assessment runner (src/app/assessment/page.tsx)</w:t>
+      </w:r>
+    </w:p>
+    <w:p>
+      <w:pPr>
+        <w:pStyle w:val="ListParagraph"/>
+        <w:numPr>
+          <w:ilvl w:val="0"/>
+          <w:numId w:val="2"/>
+        </w:numPr>
+        <w:spacing w:after="60" w:line="264"/>
+      </w:pPr>
+      <w:r>
+        <w:rPr>
+          <w:color w:val="1B2138"/>
+          <w:sz w:val="21"/>
+          <w:szCs w:val="21"/>
+        </w:rPr>
+        <w:t xml:space="preserve">State persists to localStorage (zarban_assessment) so a refresh mid-test resumes.</w:t>
+      </w:r>
+    </w:p>
+    <w:p>
+      <w:pPr>
+        <w:pStyle w:val="ListParagraph"/>
+        <w:numPr>
+          <w:ilvl w:val="0"/>
+          <w:numId w:val="2"/>
+        </w:numPr>
+        <w:spacing w:after="60" w:line="264"/>
+      </w:pPr>
+      <w:r>
+        <w:rPr>
+          <w:color w:val="1B2138"/>
+          <w:sz w:val="21"/>
+          <w:szCs w:val="21"/>
+        </w:rPr>
+        <w:t xml:space="preserve">Selecting an option (click or key A–D) submits immediately — no submit button.</w:t>
+      </w:r>
+    </w:p>
+    <w:p>
+      <w:pPr>
+        <w:pStyle w:val="ListParagraph"/>
+        <w:numPr>
+          <w:ilvl w:val="0"/>
+          <w:numId w:val="2"/>
+        </w:numPr>
+        <w:spacing w:after="60" w:line="264"/>
+      </w:pPr>
+      <w:r>
+        <w:rPr>
+          <w:color w:val="1B2138"/>
+          <w:sz w:val="21"/>
+          <w:szCs w:val="21"/>
+        </w:rPr>
+        <w:t xml:space="preserve">One silent retry on a network blip so a student is never stranded.</w:t>
+      </w:r>
+    </w:p>
+    <w:p>
+      <w:pPr>
+        <w:pStyle w:val="ListParagraph"/>
+        <w:numPr>
+          <w:ilvl w:val="0"/>
+          <w:numId w:val="2"/>
+        </w:numPr>
+        <w:spacing w:after="60" w:line="264"/>
+      </w:pPr>
+      <w:r>
+        <w:rPr>
+          <w:color w:val="1B2138"/>
+          <w:sz w:val="21"/>
+          <w:szCs w:val="21"/>
+        </w:rPr>
+        <w:t xml:space="preserve">A stopwatch derives elapsed time from an absolute start timestamp (accurate across backgrounded tabs).</w:t>
+      </w:r>
+    </w:p>
+    <w:p>
+      <w:pPr>
+        <w:pStyle w:val="Heading2"/>
+        <w:spacing w:after="90" w:before="220"/>
+      </w:pPr>
+      <w:r>
+        <w:rPr>
+          <w:b/>
+          <w:bCs/>
+          <w:color w:val="1B2138"/>
+          <w:sz w:val="25"/>
+          <w:szCs w:val="25"/>
+        </w:rPr>
+        <w:t xml:space="preserve">5.2 The diagnostic report (src/lib/engine/report.ts)</w:t>
+      </w:r>
+    </w:p>
+    <w:p>
+      <w:pPr>
+        <w:spacing w:after="120" w:line="276"/>
+      </w:pPr>
+      <w:r>
+        <w:rPr>
+          <w:color w:val="1B2138"/>
+          <w:sz w:val="21"/>
+          <w:szCs w:val="21"/>
+        </w:rPr>
+        <w:t xml:space="preserve">Aggregates a session into: grade-equivalent estimate, root-cause narrative, behaviour flags (likely lucky guesses = correct-but-&lt;3s on medium/hard; rushed answers), the five learning dimensions, skill mastery map, and per-question error analysis.</w:t>
+      </w:r>
+    </w:p>
+    <w:tbl>
+      <w:tblPr>
+        <w:tblW w:type="dxa" w:w="9026"/>
+        <w:tblBorders>
+          <w:top w:val="single" w:color="D9DCEA" w:sz="4"/>
+          <w:left w:val="single" w:color="D9DCEA" w:sz="4"/>
+          <w:bottom w:val="single" w:color="D9DCEA" w:sz="4"/>
+          <w:right w:val="single" w:color="D9DCEA" w:sz="4"/>
+          <w:insideH w:val="single" w:color="D9DCEA" w:sz="4"/>
+          <w:insideV w:val="single" w:color="D9DCEA" w:sz="4"/>
+        </w:tblBorders>
+      </w:tblPr>
+      <w:tblGrid>
+        <w:gridCol w:w="9026"/>
+      </w:tblGrid>
+      <w:tr>
+        <w:tc>
+          <w:tcPr>
+            <w:tcW w:type="dxa" w:w="9026"/>
+            <w:tcMar>
+              <w:top w:type="dxa" w:w="60"/>
+              <w:left w:type="dxa" w:w="60"/>
+              <w:bottom w:type="dxa" w:w="60"/>
+              <w:right w:type="dxa" w:w="60"/>
+            </w:tcMar>
+          </w:tcPr>
+          <w:p>
+            <w:pPr>
+              <w:spacing w:after="0"/>
+              <w:jc w:val="center"/>
+            </w:pPr>
+            <w:r>
+              <w:drawing>
+                <wp:inline distT="0" distB="0" distL="0" distR="0">
+                  <wp:extent cx="5600700" cy="5133975"/>
+                  <wp:effectExtent t="0" r="0" b="0" l="0"/>
+                  <wp:docPr id="1" name="" descr="" title=""/>
+                  <wp:cNvGraphicFramePr>
+                    <a:graphicFrameLocks xmlns:a="http://schemas.openxmlformats.org/drawingml/2006/main" noChangeAspect="1"/>
+                  </wp:cNvGraphicFramePr>
+                  <a:graphic xmlns:a="http://schemas.openxmlformats.org/drawingml/2006/main">
+                    <a:graphicData uri="http://schemas.openxmlformats.org/drawingml/2006/picture">
+                      <pic:pic xmlns:pic="http://schemas.openxmlformats.org/drawingml/2006/picture">
+                        <pic:nvPicPr>
+                          <pic:cNvPr id="0" name="" descr=""/>
+                          <pic:cNvPicPr>
+                            <a:picLocks noChangeAspect="1" noChangeArrowheads="1"/>
+                          </pic:cNvPicPr>
+                        </pic:nvPicPr>
+                        <pic:blipFill>
+                          <a:blip r:embed="rId10" cstate="none"/>
+                          <a:srcRect/>
+                          <a:stretch>
+                            <a:fillRect/>
+                          </a:stretch>
+                        </pic:blipFill>
+                        <pic:spPr bwMode="auto">
+                          <a:xfrm>
+                            <a:off x="0" y="0"/>
+                            <a:ext cx="5600700" cy="5133975"/>
+                          </a:xfrm>
+                          <a:prstGeom prst="rect">
+                            <a:avLst/>
+                          </a:prstGeom>
+                        </pic:spPr>
+                      </pic:pic>
+                    </a:graphicData>
+                  </a:graphic>
+                </wp:inline>
+              </w:drawing>
+            </w:r>
+          </w:p>
+        </w:tc>
+      </w:tr>
+    </w:tbl>
+    <w:p>
+      <w:pPr>
+        <w:spacing w:after="200" w:before="40"/>
+        <w:jc w:val="center"/>
+      </w:pPr>
+      <w:r>
+        <w:rPr>
+          <w:i/>
+          <w:iCs/>
+          <w:color w:val="5A6178"/>
+          <w:sz w:val="18"/>
+          <w:szCs w:val="18"/>
+        </w:rPr>
+        <w:t xml:space="preserve">Figure 4 — The diagnostic report (/report/&lt;id&gt;): grade-level estimate and score gauge, the root-cause diagnosis, the lucky-guess / rushed behaviour card, the five learning dimensions, and the error-pattern breakdown.</w:t>
+      </w:r>
+    </w:p>
+    <w:p>
+      <w:r>
+        <w:br w:type="page"/>
+      </w:r>
+    </w:p>
+    <w:p>
+      <w:pPr>
+        <w:pStyle w:val="Heading1"/>
+        <w:spacing w:after="140" w:before="320"/>
+      </w:pPr>
+      <w:r>
+        <w:rPr>
+          <w:b/>
+          <w:bCs/>
+          <w:color w:val="4F46E5"/>
+          <w:sz w:val="30"/>
+          <w:szCs w:val="30"/>
+        </w:rPr>
+        <w:t xml:space="preserve">Phase 6 — Admin Console &amp; Content Studio</w:t>
+      </w:r>
+    </w:p>
+    <w:p>
+      <w:pPr>
+        <w:pStyle w:val="ListParagraph"/>
+        <w:numPr>
+          <w:ilvl w:val="0"/>
+          <w:numId w:val="2"/>
+        </w:numPr>
+        <w:spacing w:after="60" w:line="264"/>
+      </w:pPr>
+      <w:r>
+        <w:rPr>
+          <w:b/>
+          <w:bCs/>
+        </w:rPr>
+        <w:t xml:space="preserve">Shell </w:t>
+      </w:r>
+      <w:r>
+        <w:t xml:space="preserve">(src/app/admin/layout.tsx): a grouped sidebar (Analytics / Administration / Content Studio) filtered per role by canSee(access, role); JWT verified via /api/admin/auth/me.</w:t>
+      </w:r>
+    </w:p>
+    <w:p>
+      <w:pPr>
+        <w:pStyle w:val="ListParagraph"/>
+        <w:numPr>
+          <w:ilvl w:val="0"/>
+          <w:numId w:val="2"/>
+        </w:numPr>
+        <w:spacing w:after="60" w:line="264"/>
+      </w:pPr>
+      <w:r>
+        <w:rPr>
+          <w:b/>
+          <w:bCs/>
+        </w:rPr>
+        <w:t xml:space="preserve">Dashboard </w:t>
+      </w:r>
+      <w:r>
+        <w:t xml:space="preserve">(/admin): totals, top skill gaps, a role-aware quick-actions launchpad, average score by grade, and a class-level failure heatmap.</w:t>
+      </w:r>
+    </w:p>
+    <w:p>
+      <w:pPr>
+        <w:pStyle w:val="ListParagraph"/>
+        <w:numPr>
+          <w:ilvl w:val="0"/>
+          <w:numId w:val="2"/>
+        </w:numPr>
+        <w:spacing w:after="60" w:line="264"/>
+      </w:pPr>
+      <w:r>
+        <w:rPr>
+          <w:b/>
+          <w:bCs/>
+        </w:rPr>
+        <w:t xml:space="preserve">Surfaces </w:t>
+      </w:r>
+      <w:r>
+        <w:t xml:space="preserve">Cohort Analytics, Students (+per-student drill-down), Classrooms (+teacher “Mine” scoping), Question Bank, Syllabus, User Access, System &amp; Audit.</w:t>
+      </w:r>
+    </w:p>
+    <w:p>
+      <w:pPr>
+        <w:pStyle w:val="ListParagraph"/>
+        <w:numPr>
+          <w:ilvl w:val="0"/>
+          <w:numId w:val="2"/>
+        </w:numPr>
+        <w:spacing w:after="60" w:line="264"/>
+      </w:pPr>
+      <w:r>
+        <w:rPr>
+          <w:b/>
+          <w:bCs/>
+        </w:rPr>
+        <w:t xml:space="preserve">Content Studio </w:t>
+      </w:r>
+      <w:r>
+        <w:t xml:space="preserve">the interactive skills knowledge graph, Syllabus, Curriculum, Questions, Import/Export.</w:t>
       </w:r>
     </w:p>
     <w:tbl>
@@ -2994,7 +3917,7 @@
         <w:tc>
           <w:tcPr>
             <w:tcW w:type="dxa" w:w="9026"/>
-            <w:shd w:fill="EEF0FE" w:val="clear"/>
+            <w:shd w:fill="FFF4E5" w:val="clear"/>
             <w:tcMar>
               <w:top w:type="dxa" w:w="90"/>
               <w:left w:type="dxa" w:w="160"/>
@@ -3011,11 +3934,11 @@
                 <w:b/>
                 <w:bCs/>
                 <w:caps/>
-                <w:color w:val="7C3AED"/>
+                <w:color w:val="B45309"/>
                 <w:sz w:val="18"/>
                 <w:szCs w:val="18"/>
               </w:rPr>
-              <w:t xml:space="preserve">Reasoning  </w:t>
+              <w:t xml:space="preserve">⚠ Pitfall  </w:t>
             </w:r>
             <w:r>
               <w:rPr>
@@ -3023,132 +3946,304 @@
                 <w:sz w:val="20"/>
                 <w:szCs w:val="20"/>
               </w:rPr>
-              <w:t xml:space="preserve">A credible diagnostic needs hundreds of calibrated, trap-annotated items. Hand-authoring is infeasible; a parametric generator with an automated quality gate was built instead.</w:t>
+              <w:t xml:space="preserve">A client component importing a module that transitively pulls in src/lib/db.ts (which imports cloudflare:workers) breaks the client build. Fix: client-safe constants were split out (e.g. SUBJECT_BLURB → src/lib/curriculum/subject-blurb.ts).</w:t>
             </w:r>
           </w:p>
         </w:tc>
       </w:tr>
     </w:tbl>
-    <w:p>
-      <w:pPr>
-        <w:spacing w:after="60"/>
-      </w:pPr>
-      <w:r>
-        <w:rPr>
-          <w:sz w:val="8"/>
-          <w:szCs w:val="8"/>
-        </w:rPr>
-        <w:t xml:space="preserve"/>
-      </w:r>
-    </w:p>
-    <w:p>
-      <w:pPr>
-        <w:pStyle w:val="ListParagraph"/>
-        <w:numPr>
-          <w:ilvl w:val="0"/>
-          <w:numId w:val="2"/>
-        </w:numPr>
-        <w:spacing w:after="60" w:line="264"/>
-      </w:pPr>
-      <w:r>
-        <w:rPr>
-          <w:rFonts w:ascii="Consolas" w:cs="Consolas" w:eastAsia="Consolas" w:hAnsi="Consolas"/>
-          <w:color w:val="334155"/>
-          <w:sz w:val="19"/>
-          <w:szCs w:val="19"/>
-        </w:rPr>
-        <w:t xml:space="preserve">scripts/generate-workbook.ts</w:t>
-      </w:r>
-      <w:r>
-        <w:t xml:space="preserve"> + </w:t>
-      </w:r>
-      <w:r>
-        <w:rPr>
-          <w:rFonts w:ascii="Consolas" w:cs="Consolas" w:eastAsia="Consolas" w:hAnsi="Consolas"/>
-          <w:color w:val="334155"/>
-          <w:sz w:val="19"/>
-          <w:szCs w:val="19"/>
-        </w:rPr>
-        <w:t xml:space="preserve">scripts/workbook/builders.ts</w:t>
-      </w:r>
-      <w:r>
-        <w:t xml:space="preserve"> — parametric templates emit questions per {skill, grade, band} with IRT parameters, distractors and traps; a PLAN controls counts per band, a retry budget guarantees coverage.</w:t>
-      </w:r>
-    </w:p>
-    <w:p>
-      <w:pPr>
-        <w:pStyle w:val="ListParagraph"/>
-        <w:numPr>
-          <w:ilvl w:val="0"/>
-          <w:numId w:val="2"/>
-        </w:numPr>
-        <w:spacing w:after="60" w:line="264"/>
-      </w:pPr>
-      <w:r>
-        <w:rPr>
-          <w:rFonts w:ascii="Consolas" w:cs="Consolas" w:eastAsia="Consolas" w:hAnsi="Consolas"/>
-          <w:color w:val="334155"/>
-          <w:sz w:val="19"/>
-          <w:szCs w:val="19"/>
-        </w:rPr>
-        <w:t xml:space="preserve">scripts/verify-workbook.ts</w:t>
-      </w:r>
-      <w:r>
-        <w:t xml:space="preserve"> — the QA gate: rejects the workbook if any item lacks a correct option, traps, or valid IRT params; enforces per-cell coverage.</w:t>
-      </w:r>
-    </w:p>
-    <w:p>
-      <w:pPr>
-        <w:pStyle w:val="ListParagraph"/>
-        <w:numPr>
-          <w:ilvl w:val="0"/>
-          <w:numId w:val="2"/>
-        </w:numPr>
-        <w:spacing w:after="60" w:line="264"/>
-      </w:pPr>
-      <w:r>
-        <w:rPr>
-          <w:rFonts w:ascii="Consolas" w:cs="Consolas" w:eastAsia="Consolas" w:hAnsi="Consolas"/>
-          <w:color w:val="334155"/>
-          <w:sz w:val="19"/>
-          <w:szCs w:val="19"/>
-        </w:rPr>
-        <w:t xml:space="preserve">scripts/seed-devdb.ts</w:t>
-      </w:r>
-      <w:r>
-        <w:t xml:space="preserve"> + </w:t>
-      </w:r>
-      <w:r>
-        <w:rPr>
-          <w:rFonts w:ascii="Consolas" w:cs="Consolas" w:eastAsia="Consolas" w:hAnsi="Consolas"/>
-          <w:color w:val="334155"/>
-          <w:sz w:val="19"/>
-          <w:szCs w:val="19"/>
-        </w:rPr>
-        <w:t xml:space="preserve">scripts/seed-curriculum.ts</w:t>
-      </w:r>
-      <w:r>
-        <w:t xml:space="preserve"> — load the workbook, the NCERT curriculum, staff accounts, and settings.</w:t>
-      </w:r>
-    </w:p>
-    <w:p>
-      <w:pPr>
-        <w:pStyle w:val="ListParagraph"/>
-        <w:numPr>
-          <w:ilvl w:val="0"/>
-          <w:numId w:val="2"/>
-        </w:numPr>
-        <w:spacing w:after="60" w:line="264"/>
+    <w:tbl>
+      <w:tblPr>
+        <w:tblW w:type="dxa" w:w="9026"/>
+        <w:tblBorders>
+          <w:top w:val="single" w:color="D9DCEA" w:sz="4"/>
+          <w:left w:val="single" w:color="D9DCEA" w:sz="4"/>
+          <w:bottom w:val="single" w:color="D9DCEA" w:sz="4"/>
+          <w:right w:val="single" w:color="D9DCEA" w:sz="4"/>
+          <w:insideH w:val="single" w:color="D9DCEA" w:sz="4"/>
+          <w:insideV w:val="single" w:color="D9DCEA" w:sz="4"/>
+        </w:tblBorders>
+      </w:tblPr>
+      <w:tblGrid>
+        <w:gridCol w:w="9026"/>
+      </w:tblGrid>
+      <w:tr>
+        <w:tc>
+          <w:tcPr>
+            <w:tcW w:type="dxa" w:w="9026"/>
+            <w:tcMar>
+              <w:top w:type="dxa" w:w="60"/>
+              <w:left w:type="dxa" w:w="60"/>
+              <w:bottom w:type="dxa" w:w="60"/>
+              <w:right w:type="dxa" w:w="60"/>
+            </w:tcMar>
+          </w:tcPr>
+          <w:p>
+            <w:pPr>
+              <w:spacing w:after="0"/>
+              <w:jc w:val="center"/>
+            </w:pPr>
+            <w:r>
+              <w:drawing>
+                <wp:inline distT="0" distB="0" distL="0" distR="0">
+                  <wp:extent cx="5600700" cy="3695700"/>
+                  <wp:effectExtent t="0" r="0" b="0" l="0"/>
+                  <wp:docPr id="1" name="" descr="" title=""/>
+                  <wp:cNvGraphicFramePr>
+                    <a:graphicFrameLocks xmlns:a="http://schemas.openxmlformats.org/drawingml/2006/main" noChangeAspect="1"/>
+                  </wp:cNvGraphicFramePr>
+                  <a:graphic xmlns:a="http://schemas.openxmlformats.org/drawingml/2006/main">
+                    <a:graphicData uri="http://schemas.openxmlformats.org/drawingml/2006/picture">
+                      <pic:pic xmlns:pic="http://schemas.openxmlformats.org/drawingml/2006/picture">
+                        <pic:nvPicPr>
+                          <pic:cNvPr id="0" name="" descr=""/>
+                          <pic:cNvPicPr>
+                            <a:picLocks noChangeAspect="1" noChangeArrowheads="1"/>
+                          </pic:cNvPicPr>
+                        </pic:nvPicPr>
+                        <pic:blipFill>
+                          <a:blip r:embed="rId11" cstate="none"/>
+                          <a:srcRect/>
+                          <a:stretch>
+                            <a:fillRect/>
+                          </a:stretch>
+                        </pic:blipFill>
+                        <pic:spPr bwMode="auto">
+                          <a:xfrm>
+                            <a:off x="0" y="0"/>
+                            <a:ext cx="5600700" cy="3695700"/>
+                          </a:xfrm>
+                          <a:prstGeom prst="rect">
+                            <a:avLst/>
+                          </a:prstGeom>
+                        </pic:spPr>
+                      </pic:pic>
+                    </a:graphicData>
+                  </a:graphic>
+                </wp:inline>
+              </w:drawing>
+            </w:r>
+          </w:p>
+        </w:tc>
+      </w:tr>
+    </w:tbl>
+    <w:p>
+      <w:pPr>
+        <w:spacing w:after="200" w:before="40"/>
+        <w:jc w:val="center"/>
+      </w:pPr>
+      <w:r>
+        <w:rPr>
+          <w:i/>
+          <w:iCs/>
+          <w:color w:val="5A6178"/>
+          <w:sz w:val="18"/>
+          <w:szCs w:val="18"/>
+        </w:rPr>
+        <w:t xml:space="preserve">Figure 5 — The admin command center (/admin): stat tiles, “Top skill gaps,” the quick-actions launchpad, average score by grade, and the class-level skill-failure heatmap.</w:t>
+      </w:r>
+    </w:p>
+    <w:tbl>
+      <w:tblPr>
+        <w:tblW w:type="dxa" w:w="9026"/>
+        <w:tblBorders>
+          <w:top w:val="single" w:color="D9DCEA" w:sz="4"/>
+          <w:left w:val="single" w:color="D9DCEA" w:sz="4"/>
+          <w:bottom w:val="single" w:color="D9DCEA" w:sz="4"/>
+          <w:right w:val="single" w:color="D9DCEA" w:sz="4"/>
+          <w:insideH w:val="single" w:color="D9DCEA" w:sz="4"/>
+          <w:insideV w:val="single" w:color="D9DCEA" w:sz="4"/>
+        </w:tblBorders>
+      </w:tblPr>
+      <w:tblGrid>
+        <w:gridCol w:w="9026"/>
+      </w:tblGrid>
+      <w:tr>
+        <w:tc>
+          <w:tcPr>
+            <w:tcW w:type="dxa" w:w="9026"/>
+            <w:tcMar>
+              <w:top w:type="dxa" w:w="60"/>
+              <w:left w:type="dxa" w:w="60"/>
+              <w:bottom w:type="dxa" w:w="60"/>
+              <w:right w:type="dxa" w:w="60"/>
+            </w:tcMar>
+          </w:tcPr>
+          <w:p>
+            <w:pPr>
+              <w:spacing w:after="0"/>
+              <w:jc w:val="center"/>
+            </w:pPr>
+            <w:r>
+              <w:drawing>
+                <wp:inline distT="0" distB="0" distL="0" distR="0">
+                  <wp:extent cx="5600700" cy="3695700"/>
+                  <wp:effectExtent t="0" r="0" b="0" l="0"/>
+                  <wp:docPr id="1" name="" descr="" title=""/>
+                  <wp:cNvGraphicFramePr>
+                    <a:graphicFrameLocks xmlns:a="http://schemas.openxmlformats.org/drawingml/2006/main" noChangeAspect="1"/>
+                  </wp:cNvGraphicFramePr>
+                  <a:graphic xmlns:a="http://schemas.openxmlformats.org/drawingml/2006/main">
+                    <a:graphicData uri="http://schemas.openxmlformats.org/drawingml/2006/picture">
+                      <pic:pic xmlns:pic="http://schemas.openxmlformats.org/drawingml/2006/picture">
+                        <pic:nvPicPr>
+                          <pic:cNvPr id="0" name="" descr=""/>
+                          <pic:cNvPicPr>
+                            <a:picLocks noChangeAspect="1" noChangeArrowheads="1"/>
+                          </pic:cNvPicPr>
+                        </pic:nvPicPr>
+                        <pic:blipFill>
+                          <a:blip r:embed="rId12" cstate="none"/>
+                          <a:srcRect/>
+                          <a:stretch>
+                            <a:fillRect/>
+                          </a:stretch>
+                        </pic:blipFill>
+                        <pic:spPr bwMode="auto">
+                          <a:xfrm>
+                            <a:off x="0" y="0"/>
+                            <a:ext cx="5600700" cy="3695700"/>
+                          </a:xfrm>
+                          <a:prstGeom prst="rect">
+                            <a:avLst/>
+                          </a:prstGeom>
+                        </pic:spPr>
+                      </pic:pic>
+                    </a:graphicData>
+                  </a:graphic>
+                </wp:inline>
+              </w:drawing>
+            </w:r>
+          </w:p>
+        </w:tc>
+      </w:tr>
+    </w:tbl>
+    <w:p>
+      <w:pPr>
+        <w:spacing w:after="200" w:before="40"/>
+        <w:jc w:val="center"/>
+      </w:pPr>
+      <w:r>
+        <w:rPr>
+          <w:i/>
+          <w:iCs/>
+          <w:color w:val="5A6178"/>
+          <w:sz w:val="18"/>
+          <w:szCs w:val="18"/>
+        </w:rPr>
+        <w:t xml:space="preserve">Figure 6 — The interactive skills knowledge graph (/content/skills): every skill a node, colour-coded by domain, wired by the prerequisites the engine traverses.</w:t>
+      </w:r>
+    </w:p>
+    <w:tbl>
+      <w:tblPr>
+        <w:tblW w:type="dxa" w:w="9026"/>
+        <w:tblBorders>
+          <w:top w:val="single" w:color="D9DCEA" w:sz="4"/>
+          <w:left w:val="single" w:color="D9DCEA" w:sz="4"/>
+          <w:bottom w:val="single" w:color="D9DCEA" w:sz="4"/>
+          <w:right w:val="single" w:color="D9DCEA" w:sz="4"/>
+          <w:insideH w:val="single" w:color="D9DCEA" w:sz="4"/>
+          <w:insideV w:val="single" w:color="D9DCEA" w:sz="4"/>
+        </w:tblBorders>
+      </w:tblPr>
+      <w:tblGrid>
+        <w:gridCol w:w="9026"/>
+      </w:tblGrid>
+      <w:tr>
+        <w:tc>
+          <w:tcPr>
+            <w:tcW w:type="dxa" w:w="9026"/>
+            <w:tcMar>
+              <w:top w:type="dxa" w:w="60"/>
+              <w:left w:type="dxa" w:w="60"/>
+              <w:bottom w:type="dxa" w:w="60"/>
+              <w:right w:type="dxa" w:w="60"/>
+            </w:tcMar>
+          </w:tcPr>
+          <w:p>
+            <w:pPr>
+              <w:spacing w:after="0"/>
+              <w:jc w:val="center"/>
+            </w:pPr>
+            <w:r>
+              <w:drawing>
+                <wp:inline distT="0" distB="0" distL="0" distR="0">
+                  <wp:extent cx="5600700" cy="3695700"/>
+                  <wp:effectExtent t="0" r="0" b="0" l="0"/>
+                  <wp:docPr id="1" name="" descr="" title=""/>
+                  <wp:cNvGraphicFramePr>
+                    <a:graphicFrameLocks xmlns:a="http://schemas.openxmlformats.org/drawingml/2006/main" noChangeAspect="1"/>
+                  </wp:cNvGraphicFramePr>
+                  <a:graphic xmlns:a="http://schemas.openxmlformats.org/drawingml/2006/main">
+                    <a:graphicData uri="http://schemas.openxmlformats.org/drawingml/2006/picture">
+                      <pic:pic xmlns:pic="http://schemas.openxmlformats.org/drawingml/2006/picture">
+                        <pic:nvPicPr>
+                          <pic:cNvPr id="0" name="" descr=""/>
+                          <pic:cNvPicPr>
+                            <a:picLocks noChangeAspect="1" noChangeArrowheads="1"/>
+                          </pic:cNvPicPr>
+                        </pic:nvPicPr>
+                        <pic:blipFill>
+                          <a:blip r:embed="rId13" cstate="none"/>
+                          <a:srcRect/>
+                          <a:stretch>
+                            <a:fillRect/>
+                          </a:stretch>
+                        </pic:blipFill>
+                        <pic:spPr bwMode="auto">
+                          <a:xfrm>
+                            <a:off x="0" y="0"/>
+                            <a:ext cx="5600700" cy="3695700"/>
+                          </a:xfrm>
+                          <a:prstGeom prst="rect">
+                            <a:avLst/>
+                          </a:prstGeom>
+                        </pic:spPr>
+                      </pic:pic>
+                    </a:graphicData>
+                  </a:graphic>
+                </wp:inline>
+              </w:drawing>
+            </w:r>
+          </w:p>
+        </w:tc>
+      </w:tr>
+    </w:tbl>
+    <w:p>
+      <w:pPr>
+        <w:spacing w:after="200" w:before="40"/>
+        <w:jc w:val="center"/>
+      </w:pPr>
+      <w:r>
+        <w:rPr>
+          <w:i/>
+          <w:iCs/>
+          <w:color w:val="5A6178"/>
+          <w:sz w:val="18"/>
+          <w:szCs w:val="18"/>
+        </w:rPr>
+        <w:t xml:space="preserve">Figure 7 — Cohort analytics (/admin/analytics): grade-level performance trend, most common error types, and the prerequisite-gap tracker.</w:t>
+      </w:r>
+    </w:p>
+    <w:p>
+      <w:r>
+        <w:br w:type="page"/>
+      </w:r>
+    </w:p>
+    <w:p>
+      <w:pPr>
+        <w:pStyle w:val="Heading1"/>
+        <w:spacing w:after="140" w:before="320"/>
       </w:pPr>
       <w:r>
         <w:rPr>
           <w:b/>
           <w:bCs/>
-        </w:rPr>
-        <w:t xml:space="preserve">Output: </w:t>
-      </w:r>
-      <w:r>
-        <w:t xml:space="preserve">911 QA-passed items across the grade/skill/band matrix.</w:t>
+          <w:color w:val="4F46E5"/>
+          <w:sz w:val="30"/>
+          <w:szCs w:val="30"/>
+        </w:rPr>
+        <w:t xml:space="preserve">Phase 7 — The Database Manager</w:t>
       </w:r>
     </w:p>
     <w:tbl>
@@ -3170,7 +4265,7 @@
         <w:tc>
           <w:tcPr>
             <w:tcW w:type="dxa" w:w="9026"/>
-            <w:shd w:fill="FFF4E5" w:val="clear"/>
+            <w:shd w:fill="EEF0FE" w:val="clear"/>
             <w:tcMar>
               <w:top w:type="dxa" w:w="90"/>
               <w:left w:type="dxa" w:w="160"/>
@@ -3187,11 +4282,11 @@
                 <w:b/>
                 <w:bCs/>
                 <w:caps/>
-                <w:color w:val="B45309"/>
+                <w:color w:val="7C3AED"/>
                 <w:sz w:val="18"/>
                 <w:szCs w:val="18"/>
               </w:rPr>
-              <w:t xml:space="preserve">⚠ Pitfall  </w:t>
+              <w:t xml:space="preserve">Reasoning  </w:t>
             </w:r>
             <w:r>
               <w:rPr>
@@ -3199,7 +4294,127 @@
                 <w:sz w:val="20"/>
                 <w:szCs w:val="20"/>
               </w:rPr>
-              <w:t xml:space="preserve">Generation occasionally under-fills a sparse cell. Fix: the retry budget + the verify gate fail the build loudly rather than shipping thin coverage.</w:t>
+              <w:t xml:space="preserve">Admins asked to “see and manage the entire database.” Rather than hard-code a CRUD page per table, a generic, schema-introspecting manager was built (src/lib/admin/db-admin.ts + /api/admin/db + /admin/database).</w:t>
+            </w:r>
+          </w:p>
+        </w:tc>
+      </w:tr>
+    </w:tbl>
+    <w:p>
+      <w:pPr>
+        <w:spacing w:after="60"/>
+      </w:pPr>
+      <w:r>
+        <w:rPr>
+          <w:sz w:val="8"/>
+          <w:szCs w:val="8"/>
+        </w:rPr>
+        <w:t xml:space="preserve"/>
+      </w:r>
+    </w:p>
+    <w:p>
+      <w:pPr>
+        <w:pStyle w:val="ListParagraph"/>
+        <w:numPr>
+          <w:ilvl w:val="0"/>
+          <w:numId w:val="2"/>
+        </w:numPr>
+        <w:spacing w:after="60" w:line="264"/>
+      </w:pPr>
+      <w:r>
+        <w:rPr>
+          <w:color w:val="1B2138"/>
+          <w:sz w:val="21"/>
+          <w:szCs w:val="21"/>
+        </w:rPr>
+        <w:t xml:space="preserve">List tables + live row counts (from sqlite_master + COUNT(*)).</w:t>
+      </w:r>
+    </w:p>
+    <w:p>
+      <w:pPr>
+        <w:pStyle w:val="ListParagraph"/>
+        <w:numPr>
+          <w:ilvl w:val="0"/>
+          <w:numId w:val="2"/>
+        </w:numPr>
+        <w:spacing w:after="60" w:line="264"/>
+      </w:pPr>
+      <w:r>
+        <w:rPr>
+          <w:color w:val="1B2138"/>
+          <w:sz w:val="21"/>
+          <w:szCs w:val="21"/>
+        </w:rPr>
+        <w:t xml:space="preserve">Per-table: paginated rows + full-text search (every column CAST(... AS TEXT) LIKE ?), inline edit and delete.</w:t>
+      </w:r>
+    </w:p>
+    <w:p>
+      <w:pPr>
+        <w:pStyle w:val="ListParagraph"/>
+        <w:numPr>
+          <w:ilvl w:val="0"/>
+          <w:numId w:val="2"/>
+        </w:numPr>
+        <w:spacing w:after="60" w:line="264"/>
+      </w:pPr>
+      <w:r>
+        <w:rPr>
+          <w:color w:val="1B2138"/>
+          <w:sz w:val="21"/>
+          <w:szCs w:val="21"/>
+        </w:rPr>
+        <w:t xml:space="preserve">Rows are addressed by SQLite’s implicit rowid, so edit/delete work uniformly even on composite-PK tables.</w:t>
+      </w:r>
+    </w:p>
+    <w:tbl>
+      <w:tblPr>
+        <w:tblW w:type="dxa" w:w="9026"/>
+        <w:tblBorders>
+          <w:top w:val="none" w:color="FFFFFF" w:sz="0"/>
+          <w:left w:val="none" w:color="FFFFFF" w:sz="0"/>
+          <w:bottom w:val="none" w:color="FFFFFF" w:sz="0"/>
+          <w:right w:val="none" w:color="FFFFFF" w:sz="0"/>
+          <w:insideH w:val="none" w:color="FFFFFF" w:sz="0"/>
+          <w:insideV w:val="none" w:color="FFFFFF" w:sz="0"/>
+        </w:tblBorders>
+      </w:tblPr>
+      <w:tblGrid>
+        <w:gridCol w:w="9026"/>
+      </w:tblGrid>
+      <w:tr>
+        <w:tc>
+          <w:tcPr>
+            <w:tcW w:type="dxa" w:w="9026"/>
+            <w:shd w:fill="EEF0FE" w:val="clear"/>
+            <w:tcMar>
+              <w:top w:type="dxa" w:w="90"/>
+              <w:left w:type="dxa" w:w="160"/>
+              <w:bottom w:type="dxa" w:w="90"/>
+              <w:right w:type="dxa" w:w="160"/>
+            </w:tcMar>
+          </w:tcPr>
+          <w:p>
+            <w:pPr>
+              <w:spacing w:after="0" w:line="264"/>
+            </w:pPr>
+            <w:r>
+              <w:rPr>
+                <w:b/>
+                <w:bCs/>
+                <w:caps/>
+                <w:color w:val="7C3AED"/>
+                <w:sz w:val="18"/>
+                <w:szCs w:val="18"/>
+              </w:rPr>
+              <w:t xml:space="preserve">Security — the critical part  </w:t>
+            </w:r>
+            <w:r>
+              <w:rPr>
+                <w:color w:val="1B2138"/>
+                <w:sz w:val="20"/>
+                <w:szCs w:val="20"/>
+              </w:rPr>
+              <w:t xml:space="preserve">Table and column identifiers are whitelist-validated against the live schema before touching SQL (an injected name like skills;DROP returns “Unknown table”); all values are bound as parameters, never interpolated; the whole area is Admin-only and every write is audit-logged.</w:t>
             </w:r>
           </w:p>
         </w:tc>
@@ -3224,7 +4439,7 @@
         <w:tc>
           <w:tcPr>
             <w:tcW w:type="dxa" w:w="9026"/>
-            <w:shd w:fill="E9FBF0" w:val="clear"/>
+            <w:shd w:fill="FFF4E5" w:val="clear"/>
             <w:tcMar>
               <w:top w:type="dxa" w:w="90"/>
               <w:left w:type="dxa" w:w="160"/>
@@ -3241,11 +4456,11 @@
                 <w:b/>
                 <w:bCs/>
                 <w:caps/>
-                <w:color w:val="047857"/>
+                <w:color w:val="B45309"/>
                 <w:sz w:val="18"/>
                 <w:szCs w:val="18"/>
               </w:rPr>
-              <w:t xml:space="preserve">📷 Insert screenshot — Question Bank  </w:t>
+              <w:t xml:space="preserve">⚠ Pitfall  </w:t>
             </w:r>
             <w:r>
               <w:rPr>
@@ -3253,12 +4468,103 @@
                 <w:sz w:val="20"/>
                 <w:szCs w:val="20"/>
               </w:rPr>
-              <w:t xml:space="preserve">/admin/questions filtered to one skill, showing id, skill, grade, band, trap count and Edit/Delete controls — proof the generated bank is real, structured data.</w:t>
+              <w:t xml:space="preserve">An initial single-query optimization (UNION ALL over all tables) hit D1’s compound-SELECT term limit (SQLITE_ERROR: too many terms). Fix: reverted to concurrent per-table counts.</w:t>
             </w:r>
           </w:p>
         </w:tc>
       </w:tr>
     </w:tbl>
+    <w:tbl>
+      <w:tblPr>
+        <w:tblW w:type="dxa" w:w="9026"/>
+        <w:tblBorders>
+          <w:top w:val="single" w:color="D9DCEA" w:sz="4"/>
+          <w:left w:val="single" w:color="D9DCEA" w:sz="4"/>
+          <w:bottom w:val="single" w:color="D9DCEA" w:sz="4"/>
+          <w:right w:val="single" w:color="D9DCEA" w:sz="4"/>
+          <w:insideH w:val="single" w:color="D9DCEA" w:sz="4"/>
+          <w:insideV w:val="single" w:color="D9DCEA" w:sz="4"/>
+        </w:tblBorders>
+      </w:tblPr>
+      <w:tblGrid>
+        <w:gridCol w:w="9026"/>
+      </w:tblGrid>
+      <w:tr>
+        <w:tc>
+          <w:tcPr>
+            <w:tcW w:type="dxa" w:w="9026"/>
+            <w:tcMar>
+              <w:top w:type="dxa" w:w="60"/>
+              <w:left w:type="dxa" w:w="60"/>
+              <w:bottom w:type="dxa" w:w="60"/>
+              <w:right w:type="dxa" w:w="60"/>
+            </w:tcMar>
+          </w:tcPr>
+          <w:p>
+            <w:pPr>
+              <w:spacing w:after="0"/>
+              <w:jc w:val="center"/>
+            </w:pPr>
+            <w:r>
+              <w:drawing>
+                <wp:inline distT="0" distB="0" distL="0" distR="0">
+                  <wp:extent cx="5600700" cy="3695700"/>
+                  <wp:effectExtent t="0" r="0" b="0" l="0"/>
+                  <wp:docPr id="1" name="" descr="" title=""/>
+                  <wp:cNvGraphicFramePr>
+                    <a:graphicFrameLocks xmlns:a="http://schemas.openxmlformats.org/drawingml/2006/main" noChangeAspect="1"/>
+                  </wp:cNvGraphicFramePr>
+                  <a:graphic xmlns:a="http://schemas.openxmlformats.org/drawingml/2006/main">
+                    <a:graphicData uri="http://schemas.openxmlformats.org/drawingml/2006/picture">
+                      <pic:pic xmlns:pic="http://schemas.openxmlformats.org/drawingml/2006/picture">
+                        <pic:nvPicPr>
+                          <pic:cNvPr id="0" name="" descr=""/>
+                          <pic:cNvPicPr>
+                            <a:picLocks noChangeAspect="1" noChangeArrowheads="1"/>
+                          </pic:cNvPicPr>
+                        </pic:nvPicPr>
+                        <pic:blipFill>
+                          <a:blip r:embed="rId14" cstate="none"/>
+                          <a:srcRect/>
+                          <a:stretch>
+                            <a:fillRect/>
+                          </a:stretch>
+                        </pic:blipFill>
+                        <pic:spPr bwMode="auto">
+                          <a:xfrm>
+                            <a:off x="0" y="0"/>
+                            <a:ext cx="5600700" cy="3695700"/>
+                          </a:xfrm>
+                          <a:prstGeom prst="rect">
+                            <a:avLst/>
+                          </a:prstGeom>
+                        </pic:spPr>
+                      </pic:pic>
+                    </a:graphicData>
+                  </a:graphic>
+                </wp:inline>
+              </w:drawing>
+            </w:r>
+          </w:p>
+        </w:tc>
+      </w:tr>
+    </w:tbl>
+    <w:p>
+      <w:pPr>
+        <w:spacing w:after="200" w:before="40"/>
+        <w:jc w:val="center"/>
+      </w:pPr>
+      <w:r>
+        <w:rPr>
+          <w:i/>
+          <w:iCs/>
+          <w:color w:val="5A6178"/>
+          <w:sz w:val="18"/>
+          <w:szCs w:val="18"/>
+        </w:rPr>
+        <w:t xml:space="preserve">Figure 8 — The Database manager (/admin/database): all 20 tables with live row counts, the row grid with PK badges and edit/delete controls, and full-text search.</w:t>
+      </w:r>
+    </w:p>
     <w:p>
       <w:r>
         <w:br w:type="page"/>
@@ -3277,76 +4583,7 @@
           <w:sz w:val="30"/>
           <w:szCs w:val="30"/>
         </w:rPr>
-        <w:t xml:space="preserve">Phase 4 — Authentication &amp; RBAC</w:t>
-      </w:r>
-    </w:p>
-    <w:p>
-      <w:pPr>
-        <w:pStyle w:val="ListParagraph"/>
-        <w:numPr>
-          <w:ilvl w:val="0"/>
-          <w:numId w:val="2"/>
-        </w:numPr>
-        <w:spacing w:after="60" w:line="264"/>
-      </w:pPr>
-      <w:r>
-        <w:rPr>
-          <w:b/>
-          <w:bCs/>
-        </w:rPr>
-        <w:t xml:space="preserve">Single login endpoint </w:t>
-      </w:r>
-      <w:r>
-        <w:rPr>
-          <w:rFonts w:ascii="Consolas" w:cs="Consolas" w:eastAsia="Consolas" w:hAnsi="Consolas"/>
-          <w:color w:val="334155"/>
-          <w:sz w:val="19"/>
-          <w:szCs w:val="19"/>
-        </w:rPr>
-        <w:t xml:space="preserve">POST /api/admin/auth/login</w:t>
-      </w:r>
-      <w:r>
-        <w:t xml:space="preserve"> → verifies with bcrypt.compareSync (Workers-safe) → signs a jose JWT → sets an HttpOnly, Secure, SameSite=Lax cookie named zarban_admin.</w:t>
-      </w:r>
-    </w:p>
-    <w:p>
-      <w:pPr>
-        <w:pStyle w:val="ListParagraph"/>
-        <w:numPr>
-          <w:ilvl w:val="0"/>
-          <w:numId w:val="2"/>
-        </w:numPr>
-        <w:spacing w:after="60" w:line="264"/>
-      </w:pPr>
-      <w:r>
-        <w:rPr>
-          <w:b/>
-          <w:bCs/>
-        </w:rPr>
-        <w:t xml:space="preserve">Role hierarchy </w:t>
-      </w:r>
-      <w:r>
-        <w:t xml:space="preserve">Admin &gt; Teacher &gt; Viewer (analytics rank) plus Editor (content). Guards requireRole(min) and requireContentRole() live in src/lib/auth.ts.</w:t>
-      </w:r>
-    </w:p>
-    <w:p>
-      <w:pPr>
-        <w:pStyle w:val="ListParagraph"/>
-        <w:numPr>
-          <w:ilvl w:val="0"/>
-          <w:numId w:val="2"/>
-        </w:numPr>
-        <w:spacing w:after="60" w:line="264"/>
-      </w:pPr>
-      <w:r>
-        <w:rPr>
-          <w:b/>
-          <w:bCs/>
-        </w:rPr>
-        <w:t xml:space="preserve">Audit </w:t>
-      </w:r>
-      <w:r>
-        <w:t xml:space="preserve">every privileged action is written to AdminAuditLog via logAudit(session, action, target, detail).</w:t>
+        <w:t xml:space="preserve">Phase 8 — Deployment to Cloudflare</w:t>
       </w:r>
     </w:p>
     <w:tbl>
@@ -3368,7 +4605,7 @@
         <w:tc>
           <w:tcPr>
             <w:tcW w:type="dxa" w:w="9026"/>
-            <w:shd w:fill="FFF4E5" w:val="clear"/>
+            <w:shd w:fill="EEF0FE" w:val="clear"/>
             <w:tcMar>
               <w:top w:type="dxa" w:w="90"/>
               <w:left w:type="dxa" w:w="160"/>
@@ -3385,11 +4622,11 @@
                 <w:b/>
                 <w:bCs/>
                 <w:caps/>
-                <w:color w:val="B45309"/>
+                <w:color w:val="7C3AED"/>
                 <w:sz w:val="18"/>
                 <w:szCs w:val="18"/>
               </w:rPr>
-              <w:t xml:space="preserve">⚠ Pitfall  </w:t>
+              <w:t xml:space="preserve">Reasoning  </w:t>
             </w:r>
             <w:r>
               <w:rPr>
@@ -3397,12 +4634,322 @@
                 <w:sz w:val="20"/>
                 <w:szCs w:val="20"/>
               </w:rPr>
-              <w:t xml:space="preserve">Next.js route files may only export HTTP handlers; exporting a helper constant from a route breaks the build. Fix: shared constants (e.g. VALID_ROLES) live in src/lib/auth.ts, never in a route file.</w:t>
+              <w:t xml:space="preserve">Production runs on the same primitives as dev (cloudflare:workers, D1), so there is no host-specific rewrite. The deploy is a fixed, repeatable sequence.</w:t>
             </w:r>
           </w:p>
         </w:tc>
       </w:tr>
     </w:tbl>
+    <w:p>
+      <w:pPr>
+        <w:spacing w:after="60"/>
+      </w:pPr>
+      <w:r>
+        <w:rPr>
+          <w:sz w:val="8"/>
+          <w:szCs w:val="8"/>
+        </w:rPr>
+        <w:t xml:space="preserve"/>
+      </w:r>
+    </w:p>
+    <w:p>
+      <w:pPr>
+        <w:pStyle w:val="Heading3"/>
+        <w:spacing w:after="70" w:before="160"/>
+      </w:pPr>
+      <w:r>
+        <w:rPr>
+          <w:b/>
+          <w:bCs/>
+          <w:color w:val="334155"/>
+          <w:sz w:val="22"/>
+          <w:szCs w:val="22"/>
+        </w:rPr>
+        <w:t xml:space="preserve">One-time (per account)</w:t>
+      </w:r>
+    </w:p>
+    <w:p>
+      <w:pPr>
+        <w:pStyle w:val="ListParagraph"/>
+        <w:numPr>
+          <w:ilvl w:val="0"/>
+          <w:numId w:val="3"/>
+        </w:numPr>
+        <w:spacing w:after="60" w:line="264"/>
+      </w:pPr>
+      <w:r>
+        <w:rPr>
+          <w:rFonts w:ascii="Consolas" w:cs="Consolas" w:eastAsia="Consolas" w:hAnsi="Consolas"/>
+          <w:color w:val="334155"/>
+          <w:sz w:val="19"/>
+          <w:szCs w:val="19"/>
+        </w:rPr>
+        <w:t xml:space="preserve">npx wrangler login</w:t>
+      </w:r>
+      <w:r>
+        <w:t xml:space="preserve"> (browser OAuth — a human step; not automatable).</w:t>
+      </w:r>
+    </w:p>
+    <w:p>
+      <w:pPr>
+        <w:pStyle w:val="ListParagraph"/>
+        <w:numPr>
+          <w:ilvl w:val="0"/>
+          <w:numId w:val="3"/>
+        </w:numPr>
+        <w:spacing w:after="60" w:line="264"/>
+      </w:pPr>
+      <w:r>
+        <w:rPr>
+          <w:rFonts w:ascii="Consolas" w:cs="Consolas" w:eastAsia="Consolas" w:hAnsi="Consolas"/>
+          <w:color w:val="334155"/>
+          <w:sz w:val="19"/>
+          <w:szCs w:val="19"/>
+        </w:rPr>
+        <w:t xml:space="preserve">npx wrangler d1 create zarban</w:t>
+      </w:r>
+      <w:r>
+        <w:t xml:space="preserve"> → capture the printed database_id.</w:t>
+      </w:r>
+    </w:p>
+    <w:p>
+      <w:pPr>
+        <w:pStyle w:val="ListParagraph"/>
+        <w:numPr>
+          <w:ilvl w:val="0"/>
+          <w:numId w:val="3"/>
+        </w:numPr>
+        <w:spacing w:after="60" w:line="264"/>
+      </w:pPr>
+      <w:r>
+        <w:rPr>
+          <w:rFonts w:ascii="Consolas" w:cs="Consolas" w:eastAsia="Consolas" w:hAnsi="Consolas"/>
+          <w:color w:val="334155"/>
+          <w:sz w:val="19"/>
+          <w:szCs w:val="19"/>
+        </w:rPr>
+        <w:t xml:space="preserve">npx wrangler d1 execute zarban --remote --file=drizzle/0000_initial.sql -y</w:t>
+      </w:r>
+      <w:r>
+        <w:t xml:space="preserve"> (result: 6,447 queries, ~19,305 rows, 20 tables).</w:t>
+      </w:r>
+    </w:p>
+    <w:p>
+      <w:pPr>
+        <w:pStyle w:val="Heading3"/>
+        <w:spacing w:after="70" w:before="160"/>
+      </w:pPr>
+      <w:r>
+        <w:rPr>
+          <w:b/>
+          <w:bCs/>
+          <w:color w:val="334155"/>
+          <w:sz w:val="22"/>
+          <w:szCs w:val="22"/>
+        </w:rPr>
+        <w:t xml:space="preserve">Every deploy</w:t>
+      </w:r>
+    </w:p>
+    <w:p>
+      <w:pPr>
+        <w:pStyle w:val="ListParagraph"/>
+        <w:numPr>
+          <w:ilvl w:val="0"/>
+          <w:numId w:val="3"/>
+        </w:numPr>
+        <w:spacing w:after="60" w:line="264"/>
+      </w:pPr>
+      <w:r>
+        <w:rPr>
+          <w:rFonts w:ascii="Consolas" w:cs="Consolas" w:eastAsia="Consolas" w:hAnsi="Consolas"/>
+          <w:color w:val="334155"/>
+          <w:sz w:val="19"/>
+          <w:szCs w:val="19"/>
+        </w:rPr>
+        <w:t xml:space="preserve">npm run build</w:t>
+      </w:r>
+      <w:r>
+        <w:t xml:space="preserve"> (regenerates dist/server/ and dist/server/wrangler.json).</w:t>
+      </w:r>
+    </w:p>
+    <w:p>
+      <w:pPr>
+        <w:pStyle w:val="ListParagraph"/>
+        <w:numPr>
+          <w:ilvl w:val="0"/>
+          <w:numId w:val="3"/>
+        </w:numPr>
+        <w:spacing w:after="60" w:line="264"/>
+      </w:pPr>
+      <w:r>
+        <w:rPr>
+          <w:rFonts w:ascii="Consolas" w:cs="Consolas" w:eastAsia="Consolas" w:hAnsi="Consolas"/>
+          <w:color w:val="334155"/>
+          <w:sz w:val="19"/>
+          <w:szCs w:val="19"/>
+        </w:rPr>
+        <w:t xml:space="preserve">node scripts/patch-d1.mjs &lt;database_id&gt;</w:t>
+      </w:r>
+      <w:r>
+        <w:t xml:space="preserve"> — writes the D1 binding into the freshly-built config, so no one hand-edits generated JSON.</w:t>
+      </w:r>
+    </w:p>
+    <w:p>
+      <w:pPr>
+        <w:pStyle w:val="ListParagraph"/>
+        <w:numPr>
+          <w:ilvl w:val="0"/>
+          <w:numId w:val="3"/>
+        </w:numPr>
+        <w:spacing w:after="60" w:line="264"/>
+      </w:pPr>
+      <w:r>
+        <w:rPr>
+          <w:rFonts w:ascii="Consolas" w:cs="Consolas" w:eastAsia="Consolas" w:hAnsi="Consolas"/>
+          <w:color w:val="334155"/>
+          <w:sz w:val="19"/>
+          <w:szCs w:val="19"/>
+        </w:rPr>
+        <w:t xml:space="preserve">npx wrangler deploy</w:t>
+      </w:r>
+      <w:r>
+        <w:t xml:space="preserve"> — run from the repo root, not dist/server/.</w:t>
+      </w:r>
+    </w:p>
+    <w:p>
+      <w:pPr>
+        <w:pStyle w:val="Heading3"/>
+        <w:spacing w:after="70" w:before="160"/>
+      </w:pPr>
+      <w:r>
+        <w:rPr>
+          <w:b/>
+          <w:bCs/>
+          <w:color w:val="334155"/>
+          <w:sz w:val="22"/>
+          <w:szCs w:val="22"/>
+        </w:rPr>
+        <w:t xml:space="preserve">Post-deploy hardening</w:t>
+      </w:r>
+    </w:p>
+    <w:p>
+      <w:pPr>
+        <w:pStyle w:val="ListParagraph"/>
+        <w:numPr>
+          <w:ilvl w:val="0"/>
+          <w:numId w:val="3"/>
+        </w:numPr>
+        <w:spacing w:after="60" w:line="264"/>
+      </w:pPr>
+      <w:r>
+        <w:rPr>
+          <w:rFonts w:ascii="Consolas" w:cs="Consolas" w:eastAsia="Consolas" w:hAnsi="Consolas"/>
+          <w:color w:val="334155"/>
+          <w:sz w:val="19"/>
+          <w:szCs w:val="19"/>
+        </w:rPr>
+        <w:t xml:space="preserve">wrangler secret put AUTH_SECRET</w:t>
+      </w:r>
+      <w:r>
+        <w:t xml:space="preserve"> — replace the dev-fallback JWT secret (piped a 48-byte random value; never printed).</w:t>
+      </w:r>
+    </w:p>
+    <w:p>
+      <w:pPr>
+        <w:pStyle w:val="Heading3"/>
+        <w:spacing w:after="70" w:before="160"/>
+      </w:pPr>
+      <w:r>
+        <w:rPr>
+          <w:b/>
+          <w:bCs/>
+          <w:color w:val="334155"/>
+          <w:sz w:val="22"/>
+          <w:szCs w:val="22"/>
+        </w:rPr>
+        <w:t xml:space="preserve">Pitfalls solved during the real deployment</w:t>
+      </w:r>
+    </w:p>
+    <w:p>
+      <w:pPr>
+        <w:pStyle w:val="ListParagraph"/>
+        <w:numPr>
+          <w:ilvl w:val="0"/>
+          <w:numId w:val="2"/>
+        </w:numPr>
+        <w:spacing w:after="60" w:line="264"/>
+      </w:pPr>
+      <w:r>
+        <w:rPr>
+          <w:b/>
+          <w:bCs/>
+        </w:rPr>
+        <w:t xml:space="preserve">Deploy config collision: </w:t>
+      </w:r>
+      <w:r>
+        <w:t xml:space="preserve">running deploy from dist/server/ errors. Fix: deploy from repo root.</w:t>
+      </w:r>
+    </w:p>
+    <w:p>
+      <w:pPr>
+        <w:pStyle w:val="ListParagraph"/>
+        <w:numPr>
+          <w:ilvl w:val="0"/>
+          <w:numId w:val="2"/>
+        </w:numPr>
+        <w:spacing w:after="60" w:line="264"/>
+      </w:pPr>
+      <w:r>
+        <w:rPr>
+          <w:b/>
+          <w:bCs/>
+        </w:rPr>
+        <w:t xml:space="preserve">Cold-start transients: </w:t>
+      </w:r>
+      <w:r>
+        <w:t xml:space="preserve">the first ~30s returns sporadic 404/1042. Fix: a route-sweep once warm confirms all 200.</w:t>
+      </w:r>
+    </w:p>
+    <w:p>
+      <w:pPr>
+        <w:pStyle w:val="ListParagraph"/>
+        <w:numPr>
+          <w:ilvl w:val="0"/>
+          <w:numId w:val="2"/>
+        </w:numPr>
+        <w:spacing w:after="60" w:line="264"/>
+      </w:pPr>
+      <w:r>
+        <w:rPr>
+          <w:b/>
+          <w:bCs/>
+        </w:rPr>
+        <w:t xml:space="preserve">workers.dev subdomain: </w:t>
+      </w:r>
+      <w:r>
+        <w:t xml:space="preserve">can’t be renamed via API (error 10036) — dashboard-only, one-time. Custom domain needs a zone on the account.</w:t>
+      </w:r>
+    </w:p>
+    <w:p>
+      <w:pPr>
+        <w:pStyle w:val="ListParagraph"/>
+        <w:numPr>
+          <w:ilvl w:val="0"/>
+          <w:numId w:val="2"/>
+        </w:numPr>
+        <w:spacing w:after="60" w:line="264"/>
+      </w:pPr>
+      <w:r>
+        <w:rPr>
+          <w:b/>
+          <w:bCs/>
+        </w:rPr>
+        <w:t xml:space="preserve">Fresh subdomain SSL: </w:t>
+      </w:r>
+      <w:r>
+        <w:t xml:space="preserve">after a subdomain change, HTTPS failed the TLS handshake (curl exit 35) for a few minutes while Cloudflare issued the cert. Fix: poll until it lands.</w:t>
+      </w:r>
+    </w:p>
     <w:tbl>
       <w:tblPr>
         <w:tblW w:type="dxa" w:w="9026"/>
@@ -3422,7 +4969,7 @@
         <w:tc>
           <w:tcPr>
             <w:tcW w:type="dxa" w:w="9026"/>
-            <w:shd w:fill="EEF0FE" w:val="clear"/>
+            <w:shd w:fill="E9FBF0" w:val="clear"/>
             <w:tcMar>
               <w:top w:type="dxa" w:w="90"/>
               <w:left w:type="dxa" w:w="160"/>
@@ -3439,11 +4986,11 @@
                 <w:b/>
                 <w:bCs/>
                 <w:caps/>
-                <w:color w:val="7C3AED"/>
+                <w:color w:val="047857"/>
                 <w:sz w:val="18"/>
                 <w:szCs w:val="18"/>
               </w:rPr>
-              <w:t xml:space="preserve">Security constraint  </w:t>
+              <w:t xml:space="preserve">🎥 Screen recording — End-to-end deploy  </w:t>
             </w:r>
             <w:r>
               <w:rPr>
@@ -3451,12 +4998,33 @@
                 <w:sz w:val="20"/>
                 <w:szCs w:val="20"/>
               </w:rPr>
-              <w:t xml:space="preserve">Credential entry, account creation, and payment are out of scope for automation by design — those are performed by a human.</w:t>
+              <w:t xml:space="preserve">build → patch-d1 → deploy, then a browser hit of the live URL. ~90s. The definitive “it ships” artifact.</w:t>
             </w:r>
           </w:p>
         </w:tc>
       </w:tr>
     </w:tbl>
+    <w:p>
+      <w:r>
+        <w:br w:type="page"/>
+      </w:r>
+    </w:p>
+    <w:p>
+      <w:pPr>
+        <w:pStyle w:val="Heading1"/>
+        <w:spacing w:after="140" w:before="320"/>
+      </w:pPr>
+      <w:r>
+        <w:rPr>
+          <w:b/>
+          <w:bCs/>
+          <w:color w:val="4F46E5"/>
+          <w:sz w:val="30"/>
+          <w:szCs w:val="30"/>
+        </w:rPr>
+        <w:t xml:space="preserve">Phase 9 — Performance Optimization</w:t>
+      </w:r>
+    </w:p>
     <w:tbl>
       <w:tblPr>
         <w:tblW w:type="dxa" w:w="9026"/>
@@ -3476,7 +5044,7 @@
         <w:tc>
           <w:tcPr>
             <w:tcW w:type="dxa" w:w="9026"/>
-            <w:shd w:fill="E9FBF0" w:val="clear"/>
+            <w:shd w:fill="EEF0FE" w:val="clear"/>
             <w:tcMar>
               <w:top w:type="dxa" w:w="90"/>
               <w:left w:type="dxa" w:w="160"/>
@@ -3493,11 +5061,11 @@
                 <w:b/>
                 <w:bCs/>
                 <w:caps/>
-                <w:color w:val="047857"/>
+                <w:color w:val="7C3AED"/>
                 <w:sz w:val="18"/>
                 <w:szCs w:val="18"/>
               </w:rPr>
-              <w:t xml:space="preserve">📷 Insert screenshot — Admin login  </w:t>
+              <w:t xml:space="preserve">Reasoning  </w:t>
             </w:r>
             <w:r>
               <w:rPr>
@@ -3505,12 +5073,218 @@
                 <w:sz w:val="20"/>
                 <w:szCs w:val="20"/>
               </w:rPr>
-              <w:t xml:space="preserve">/admin/login with the demo hint admin@zarban.local visible; then a second frame of the authenticated dashboard to show the guard passing.</w:t>
+              <w:t xml:space="preserve">On Cloudflare D1, each query is a network round trip, so per-request round-trip count — not slow scans (indexes were already in place) — dominates latency. The optimization was measured, not guessed.</w:t>
             </w:r>
           </w:p>
         </w:tc>
       </w:tr>
     </w:tbl>
+    <w:p>
+      <w:pPr>
+        <w:spacing w:after="60"/>
+      </w:pPr>
+      <w:r>
+        <w:rPr>
+          <w:sz w:val="8"/>
+          <w:szCs w:val="8"/>
+        </w:rPr>
+        <w:t xml:space="preserve"/>
+      </w:r>
+    </w:p>
+    <w:p>
+      <w:pPr>
+        <w:pStyle w:val="Heading2"/>
+        <w:spacing w:after="90" w:before="220"/>
+      </w:pPr>
+      <w:r>
+        <w:rPr>
+          <w:b/>
+          <w:bCs/>
+          <w:color w:val="1B2138"/>
+          <w:sz w:val="25"/>
+          <w:szCs w:val="25"/>
+        </w:rPr>
+        <w:t xml:space="preserve">9.1 Method</w:t>
+      </w:r>
+    </w:p>
+    <w:p>
+      <w:pPr>
+        <w:pStyle w:val="ListParagraph"/>
+        <w:numPr>
+          <w:ilvl w:val="0"/>
+          <w:numId w:val="2"/>
+        </w:numPr>
+        <w:spacing w:after="60" w:line="264"/>
+      </w:pPr>
+      <w:r>
+        <w:rPr>
+          <w:color w:val="1B2138"/>
+          <w:sz w:val="21"/>
+          <w:szCs w:val="21"/>
+        </w:rPr>
+        <w:t xml:space="preserve">A benchmark runs a real assessment against production and times each POST /api/session/respond, plus a sweep of every read endpoint.</w:t>
+      </w:r>
+    </w:p>
+    <w:p>
+      <w:pPr>
+        <w:pStyle w:val="ListParagraph"/>
+        <w:numPr>
+          <w:ilvl w:val="0"/>
+          <w:numId w:val="2"/>
+        </w:numPr>
+        <w:spacing w:after="60" w:line="264"/>
+      </w:pPr>
+      <w:r>
+        <w:rPr>
+          <w:color w:val="1B2138"/>
+          <w:sz w:val="21"/>
+          <w:szCs w:val="21"/>
+        </w:rPr>
+        <w:t xml:space="preserve">Baseline: ~16–18 sequential D1 queries per answer; median respond ~480–610 ms; a fixed 350 ms client pre-submit delay on top.</w:t>
+      </w:r>
+    </w:p>
+    <w:p>
+      <w:pPr>
+        <w:pStyle w:val="Heading2"/>
+        <w:spacing w:after="90" w:before="220"/>
+      </w:pPr>
+      <w:r>
+        <w:rPr>
+          <w:b/>
+          <w:bCs/>
+          <w:color w:val="1B2138"/>
+          <w:sz w:val="25"/>
+          <w:szCs w:val="25"/>
+        </w:rPr>
+        <w:t xml:space="preserve">9.2 Changes (behaviour-preserving — all 136 e2e checks still pass)</w:t>
+      </w:r>
+    </w:p>
+    <w:p>
+      <w:pPr>
+        <w:pStyle w:val="ListParagraph"/>
+        <w:numPr>
+          <w:ilvl w:val="0"/>
+          <w:numId w:val="2"/>
+        </w:numPr>
+        <w:spacing w:after="60" w:line="264"/>
+      </w:pPr>
+      <w:r>
+        <w:rPr>
+          <w:color w:val="1B2138"/>
+          <w:sz w:val="21"/>
+          <w:szCs w:val="21"/>
+        </w:rPr>
+        <w:t xml:space="preserve">Parallelized independent reads with Promise.all (session+question; then trap+BKT-state+history).</w:t>
+      </w:r>
+    </w:p>
+    <w:p>
+      <w:pPr>
+        <w:pStyle w:val="ListParagraph"/>
+        <w:numPr>
+          <w:ilvl w:val="0"/>
+          <w:numId w:val="2"/>
+        </w:numPr>
+        <w:spacing w:after="60" w:line="264"/>
+      </w:pPr>
+      <w:r>
+        <w:rPr>
+          <w:color w:val="1B2138"/>
+          <w:sz w:val="21"/>
+          <w:szCs w:val="21"/>
+        </w:rPr>
+        <w:t xml:space="preserve">Removed a redundant re-read of the session — used the update() return value; ran the two writes concurrently.</w:t>
+      </w:r>
+    </w:p>
+    <w:p>
+      <w:pPr>
+        <w:pStyle w:val="ListParagraph"/>
+        <w:numPr>
+          <w:ilvl w:val="0"/>
+          <w:numId w:val="2"/>
+        </w:numPr>
+        <w:spacing w:after="60" w:line="264"/>
+      </w:pPr>
+      <w:r>
+        <w:rPr>
+          <w:color w:val="1B2138"/>
+          <w:sz w:val="21"/>
+          <w:szCs w:val="21"/>
+        </w:rPr>
+        <w:t xml:space="preserve">Introduced an in-isolate TTL cache (src/lib/engine/cache.ts) for near-static data (all skills, the knowledge graph, settings, the cross-session “seen” set); admin settings writes invalidate it.</w:t>
+      </w:r>
+    </w:p>
+    <w:p>
+      <w:pPr>
+        <w:pStyle w:val="ListParagraph"/>
+        <w:numPr>
+          <w:ilvl w:val="0"/>
+          <w:numId w:val="2"/>
+        </w:numPr>
+        <w:spacing w:after="60" w:line="264"/>
+      </w:pPr>
+      <w:r>
+        <w:rPr>
+          <w:color w:val="1B2138"/>
+          <w:sz w:val="21"/>
+          <w:szCs w:val="21"/>
+        </w:rPr>
+        <w:t xml:space="preserve">Trimmed the growing history query to only the columns the engine consumes.</w:t>
+      </w:r>
+    </w:p>
+    <w:p>
+      <w:pPr>
+        <w:pStyle w:val="ListParagraph"/>
+        <w:numPr>
+          <w:ilvl w:val="0"/>
+          <w:numId w:val="2"/>
+        </w:numPr>
+        <w:spacing w:after="60" w:line="264"/>
+      </w:pPr>
+      <w:r>
+        <w:rPr>
+          <w:color w:val="1B2138"/>
+          <w:sz w:val="21"/>
+          <w:szCs w:val="21"/>
+        </w:rPr>
+        <w:t xml:space="preserve">Skipped the “all skills mastered?” probe on wrong answers (mastery can’t rise).</w:t>
+      </w:r>
+    </w:p>
+    <w:p>
+      <w:pPr>
+        <w:pStyle w:val="ListParagraph"/>
+        <w:numPr>
+          <w:ilvl w:val="0"/>
+          <w:numId w:val="2"/>
+        </w:numPr>
+        <w:spacing w:after="60" w:line="264"/>
+      </w:pPr>
+      <w:r>
+        <w:rPr>
+          <w:color w:val="1B2138"/>
+          <w:sz w:val="21"/>
+          <w:szCs w:val="21"/>
+        </w:rPr>
+        <w:t xml:space="preserve">Client: submit immediately and overlap the 350 ms “choice-visible” beat with the network round trip.</w:t>
+      </w:r>
+    </w:p>
+    <w:p>
+      <w:pPr>
+        <w:pStyle w:val="ListParagraph"/>
+        <w:numPr>
+          <w:ilvl w:val="0"/>
+          <w:numId w:val="2"/>
+        </w:numPr>
+        <w:spacing w:after="60" w:line="264"/>
+      </w:pPr>
+      <w:r>
+        <w:rPr>
+          <w:color w:val="1B2138"/>
+          <w:sz w:val="21"/>
+          <w:szCs w:val="21"/>
+        </w:rPr>
+        <w:t xml:space="preserve">Applied the same treatment to the dashboard, content hub, and report endpoints.</w:t>
+      </w:r>
+    </w:p>
     <w:p>
       <w:r>
         <w:br w:type="page"/>
@@ -3529,124 +5303,71 @@
           <w:sz w:val="30"/>
           <w:szCs w:val="30"/>
         </w:rPr>
-        <w:t xml:space="preserve">Phase 5 — The Student Experience</w:t>
-      </w:r>
-    </w:p>
-    <w:p>
-      <w:pPr>
-        <w:pStyle w:val="Heading2"/>
-        <w:spacing w:after="90" w:before="220"/>
+        <w:t xml:space="preserve">Phase 10 — Testing &amp; Verification</w:t>
+      </w:r>
+    </w:p>
+    <w:p>
+      <w:pPr>
+        <w:pStyle w:val="ListParagraph"/>
+        <w:numPr>
+          <w:ilvl w:val="0"/>
+          <w:numId w:val="2"/>
+        </w:numPr>
+        <w:spacing w:after="60" w:line="264"/>
+      </w:pPr>
+      <w:r>
+        <w:rPr>
+          <w:rFonts w:ascii="Consolas" w:cs="Consolas" w:eastAsia="Consolas" w:hAnsi="Consolas"/>
+          <w:color w:val="334155"/>
+          <w:sz w:val="19"/>
+          <w:szCs w:val="19"/>
+        </w:rPr>
+        <w:t xml:space="preserve">scripts/e2e.ts</w:t>
+      </w:r>
+      <w:r>
+        <w:t xml:space="preserve"> (npm run e2e) — 136 end-to-end checks driving the real HTTP API: the full assessment lifecycle, report + analysis, admin auth and every admin view, the content portal, and RBAC denial (viewer gets 403 on privileged routes).</w:t>
+      </w:r>
+    </w:p>
+    <w:p>
+      <w:pPr>
+        <w:pStyle w:val="ListParagraph"/>
+        <w:numPr>
+          <w:ilvl w:val="0"/>
+          <w:numId w:val="2"/>
+        </w:numPr>
+        <w:spacing w:after="60" w:line="264"/>
+      </w:pPr>
+      <w:r>
+        <w:rPr>
+          <w:rFonts w:ascii="Consolas" w:cs="Consolas" w:eastAsia="Consolas" w:hAnsi="Consolas"/>
+          <w:color w:val="334155"/>
+          <w:sz w:val="19"/>
+          <w:szCs w:val="19"/>
+        </w:rPr>
+        <w:t xml:space="preserve">npx tsc --noEmit</w:t>
+      </w:r>
+      <w:r>
+        <w:t xml:space="preserve"> gates every change.</w:t>
+      </w:r>
+    </w:p>
+    <w:p>
+      <w:pPr>
+        <w:pStyle w:val="ListParagraph"/>
+        <w:numPr>
+          <w:ilvl w:val="0"/>
+          <w:numId w:val="2"/>
+        </w:numPr>
+        <w:spacing w:after="60" w:line="264"/>
       </w:pPr>
       <w:r>
         <w:rPr>
           <w:b/>
           <w:bCs/>
-          <w:color w:val="1B2138"/>
-          <w:sz w:val="25"/>
-          <w:szCs w:val="25"/>
-        </w:rPr>
-        <w:t xml:space="preserve">5.1 Assessment runner (src/app/assessment/page.tsx)</w:t>
-      </w:r>
-    </w:p>
-    <w:p>
-      <w:pPr>
-        <w:pStyle w:val="ListParagraph"/>
-        <w:numPr>
-          <w:ilvl w:val="0"/>
-          <w:numId w:val="2"/>
-        </w:numPr>
-        <w:spacing w:after="60" w:line="264"/>
-      </w:pPr>
-      <w:r>
-        <w:rPr>
-          <w:color w:val="1B2138"/>
-          <w:sz w:val="21"/>
-          <w:szCs w:val="21"/>
-        </w:rPr>
-        <w:t xml:space="preserve">State persists to localStorage (zarban_assessment) so a refresh mid-test resumes.</w:t>
-      </w:r>
-    </w:p>
-    <w:p>
-      <w:pPr>
-        <w:pStyle w:val="ListParagraph"/>
-        <w:numPr>
-          <w:ilvl w:val="0"/>
-          <w:numId w:val="2"/>
-        </w:numPr>
-        <w:spacing w:after="60" w:line="264"/>
-      </w:pPr>
-      <w:r>
-        <w:rPr>
-          <w:color w:val="1B2138"/>
-          <w:sz w:val="21"/>
-          <w:szCs w:val="21"/>
-        </w:rPr>
-        <w:t xml:space="preserve">Selecting an option (click or key A–D) submits immediately — no submit button.</w:t>
-      </w:r>
-    </w:p>
-    <w:p>
-      <w:pPr>
-        <w:pStyle w:val="ListParagraph"/>
-        <w:numPr>
-          <w:ilvl w:val="0"/>
-          <w:numId w:val="2"/>
-        </w:numPr>
-        <w:spacing w:after="60" w:line="264"/>
-      </w:pPr>
-      <w:r>
-        <w:rPr>
-          <w:color w:val="1B2138"/>
-          <w:sz w:val="21"/>
-          <w:szCs w:val="21"/>
-        </w:rPr>
-        <w:t xml:space="preserve">One silent retry on a network blip so a student is never stranded.</w:t>
-      </w:r>
-    </w:p>
-    <w:p>
-      <w:pPr>
-        <w:pStyle w:val="ListParagraph"/>
-        <w:numPr>
-          <w:ilvl w:val="0"/>
-          <w:numId w:val="2"/>
-        </w:numPr>
-        <w:spacing w:after="60" w:line="264"/>
-      </w:pPr>
-      <w:r>
-        <w:rPr>
-          <w:color w:val="1B2138"/>
-          <w:sz w:val="21"/>
-          <w:szCs w:val="21"/>
-        </w:rPr>
-        <w:t xml:space="preserve">A stopwatch derives elapsed time from an absolute start timestamp (accurate across backgrounded tabs).</w:t>
-      </w:r>
-    </w:p>
-    <w:p>
-      <w:pPr>
-        <w:pStyle w:val="Heading2"/>
-        <w:spacing w:after="90" w:before="220"/>
-      </w:pPr>
-      <w:r>
-        <w:rPr>
-          <w:b/>
-          <w:bCs/>
-          <w:color w:val="1B2138"/>
-          <w:sz w:val="25"/>
-          <w:szCs w:val="25"/>
-        </w:rPr>
-        <w:t xml:space="preserve">5.2 The diagnostic report (src/lib/engine/report.ts)</w:t>
-      </w:r>
-    </w:p>
-    <w:p>
-      <w:pPr>
-        <w:spacing w:after="120" w:line="276"/>
-      </w:pPr>
-      <w:r>
-        <w:rPr>
-          <w:color w:val="1B2138"/>
-          <w:sz w:val="21"/>
-          <w:szCs w:val="21"/>
-        </w:rPr>
-        <w:t xml:space="preserve">Aggregates a session into: grade-equivalent estimate, root-cause narrative, behaviour flags (likely lucky guesses = correct-but-&lt;3s on medium/hard; rushed answers), the five learning dimensions, skill mastery map, and per-question error analysis.</w:t>
+        </w:rPr>
+        <w:t xml:space="preserve">Browser verification </w:t>
+      </w:r>
+      <w:r>
+        <w:t xml:space="preserve">via the accessibility tree / DOM and console; production screenshots for docs are captured with headless Chrome (authenticated pages driven via the DevTools Protocol with the admin cookie).</w:t>
       </w:r>
     </w:p>
     <w:tbl>
@@ -3689,1648 +5410,7 @@
                 <w:sz w:val="18"/>
                 <w:szCs w:val="18"/>
               </w:rPr>
-              <w:t xml:space="preserve">📷 Insert screenshot — Diagnostic report  </w:t>
-            </w:r>
-            <w:r>
-              <w:rPr>
-                <w:color w:val="1B2138"/>
-                <w:sz w:val="20"/>
-                <w:szCs w:val="20"/>
-              </w:rPr>
-              <w:t xml:space="preserve">/report/&lt;id&gt; full page: the grade-level header + score gauge, the Root Cause Diagnosis paragraph, and the Test-Taking Behaviour card with the lucky-guess / rushed counts. The product’s core value in one image.</w:t>
-            </w:r>
-          </w:p>
-        </w:tc>
-      </w:tr>
-    </w:tbl>
-    <w:p>
-      <w:r>
-        <w:br w:type="page"/>
-      </w:r>
-    </w:p>
-    <w:p>
-      <w:pPr>
-        <w:pStyle w:val="Heading1"/>
-        <w:spacing w:after="140" w:before="320"/>
-      </w:pPr>
-      <w:r>
-        <w:rPr>
-          <w:b/>
-          <w:bCs/>
-          <w:color w:val="4F46E5"/>
-          <w:sz w:val="30"/>
-          <w:szCs w:val="30"/>
-        </w:rPr>
-        <w:t xml:space="preserve">Phase 6 — Admin Console &amp; Content Studio</w:t>
-      </w:r>
-    </w:p>
-    <w:p>
-      <w:pPr>
-        <w:pStyle w:val="ListParagraph"/>
-        <w:numPr>
-          <w:ilvl w:val="0"/>
-          <w:numId w:val="2"/>
-        </w:numPr>
-        <w:spacing w:after="60" w:line="264"/>
-      </w:pPr>
-      <w:r>
-        <w:rPr>
-          <w:b/>
-          <w:bCs/>
-        </w:rPr>
-        <w:t xml:space="preserve">Shell </w:t>
-      </w:r>
-      <w:r>
-        <w:t xml:space="preserve">(src/app/admin/layout.tsx): a grouped sidebar (Analytics / Administration / Content Studio) filtered per role by canSee(access, role); JWT verified via /api/admin/auth/me.</w:t>
-      </w:r>
-    </w:p>
-    <w:p>
-      <w:pPr>
-        <w:pStyle w:val="ListParagraph"/>
-        <w:numPr>
-          <w:ilvl w:val="0"/>
-          <w:numId w:val="2"/>
-        </w:numPr>
-        <w:spacing w:after="60" w:line="264"/>
-      </w:pPr>
-      <w:r>
-        <w:rPr>
-          <w:b/>
-          <w:bCs/>
-        </w:rPr>
-        <w:t xml:space="preserve">Dashboard </w:t>
-      </w:r>
-      <w:r>
-        <w:t xml:space="preserve">(/admin): totals, top skill gaps, a role-aware quick-actions launchpad, average score by grade, and a class-level failure heatmap.</w:t>
-      </w:r>
-    </w:p>
-    <w:p>
-      <w:pPr>
-        <w:pStyle w:val="ListParagraph"/>
-        <w:numPr>
-          <w:ilvl w:val="0"/>
-          <w:numId w:val="2"/>
-        </w:numPr>
-        <w:spacing w:after="60" w:line="264"/>
-      </w:pPr>
-      <w:r>
-        <w:rPr>
-          <w:b/>
-          <w:bCs/>
-        </w:rPr>
-        <w:t xml:space="preserve">Surfaces </w:t>
-      </w:r>
-      <w:r>
-        <w:t xml:space="preserve">Cohort Analytics, Students (+per-student drill-down), Classrooms (+teacher “Mine” scoping), Question Bank, Syllabus, User Access, System &amp; Audit.</w:t>
-      </w:r>
-    </w:p>
-    <w:p>
-      <w:pPr>
-        <w:pStyle w:val="ListParagraph"/>
-        <w:numPr>
-          <w:ilvl w:val="0"/>
-          <w:numId w:val="2"/>
-        </w:numPr>
-        <w:spacing w:after="60" w:line="264"/>
-      </w:pPr>
-      <w:r>
-        <w:rPr>
-          <w:b/>
-          <w:bCs/>
-        </w:rPr>
-        <w:t xml:space="preserve">Content Studio </w:t>
-      </w:r>
-      <w:r>
-        <w:t xml:space="preserve">the interactive skills knowledge graph (content/skills), Syllabus, Curriculum, Questions, Import/Export.</w:t>
-      </w:r>
-    </w:p>
-    <w:tbl>
-      <w:tblPr>
-        <w:tblW w:type="dxa" w:w="9026"/>
-        <w:tblBorders>
-          <w:top w:val="none" w:color="FFFFFF" w:sz="0"/>
-          <w:left w:val="none" w:color="FFFFFF" w:sz="0"/>
-          <w:bottom w:val="none" w:color="FFFFFF" w:sz="0"/>
-          <w:right w:val="none" w:color="FFFFFF" w:sz="0"/>
-          <w:insideH w:val="none" w:color="FFFFFF" w:sz="0"/>
-          <w:insideV w:val="none" w:color="FFFFFF" w:sz="0"/>
-        </w:tblBorders>
-      </w:tblPr>
-      <w:tblGrid>
-        <w:gridCol w:w="9026"/>
-      </w:tblGrid>
-      <w:tr>
-        <w:tc>
-          <w:tcPr>
-            <w:tcW w:type="dxa" w:w="9026"/>
-            <w:shd w:fill="FFF4E5" w:val="clear"/>
-            <w:tcMar>
-              <w:top w:type="dxa" w:w="90"/>
-              <w:left w:type="dxa" w:w="160"/>
-              <w:bottom w:type="dxa" w:w="90"/>
-              <w:right w:type="dxa" w:w="160"/>
-            </w:tcMar>
-          </w:tcPr>
-          <w:p>
-            <w:pPr>
-              <w:spacing w:after="0" w:line="264"/>
-            </w:pPr>
-            <w:r>
-              <w:rPr>
-                <w:b/>
-                <w:bCs/>
-                <w:caps/>
-                <w:color w:val="B45309"/>
-                <w:sz w:val="18"/>
-                <w:szCs w:val="18"/>
-              </w:rPr>
-              <w:t xml:space="preserve">⚠ Pitfall  </w:t>
-            </w:r>
-            <w:r>
-              <w:rPr>
-                <w:color w:val="1B2138"/>
-                <w:sz w:val="20"/>
-                <w:szCs w:val="20"/>
-              </w:rPr>
-              <w:t xml:space="preserve">A client component importing a module that transitively pulls in src/lib/db.ts (which imports cloudflare:workers) breaks the client build. Fix: client-safe constants were split out (e.g. SUBJECT_BLURB → src/lib/curriculum/subject-blurb.ts), keeping server-only Prisma out of the client bundle.</w:t>
-            </w:r>
-          </w:p>
-        </w:tc>
-      </w:tr>
-    </w:tbl>
-    <w:tbl>
-      <w:tblPr>
-        <w:tblW w:type="dxa" w:w="9026"/>
-        <w:tblBorders>
-          <w:top w:val="none" w:color="FFFFFF" w:sz="0"/>
-          <w:left w:val="none" w:color="FFFFFF" w:sz="0"/>
-          <w:bottom w:val="none" w:color="FFFFFF" w:sz="0"/>
-          <w:right w:val="none" w:color="FFFFFF" w:sz="0"/>
-          <w:insideH w:val="none" w:color="FFFFFF" w:sz="0"/>
-          <w:insideV w:val="none" w:color="FFFFFF" w:sz="0"/>
-        </w:tblBorders>
-      </w:tblPr>
-      <w:tblGrid>
-        <w:gridCol w:w="9026"/>
-      </w:tblGrid>
-      <w:tr>
-        <w:tc>
-          <w:tcPr>
-            <w:tcW w:type="dxa" w:w="9026"/>
-            <w:shd w:fill="E9FBF0" w:val="clear"/>
-            <w:tcMar>
-              <w:top w:type="dxa" w:w="90"/>
-              <w:left w:type="dxa" w:w="160"/>
-              <w:bottom w:type="dxa" w:w="90"/>
-              <w:right w:type="dxa" w:w="160"/>
-            </w:tcMar>
-          </w:tcPr>
-          <w:p>
-            <w:pPr>
-              <w:spacing w:after="0" w:line="264"/>
-            </w:pPr>
-            <w:r>
-              <w:rPr>
-                <w:b/>
-                <w:bCs/>
-                <w:caps/>
-                <w:color w:val="047857"/>
-                <w:sz w:val="18"/>
-                <w:szCs w:val="18"/>
-              </w:rPr>
-              <w:t xml:space="preserve">📷 Insert screenshot — Admin dashboard  </w:t>
-            </w:r>
-            <w:r>
-              <w:rPr>
-                <w:color w:val="1B2138"/>
-                <w:sz w:val="20"/>
-                <w:szCs w:val="20"/>
-              </w:rPr>
-              <w:t xml:space="preserve">/admin command center: the four stat tiles, “Top skill gaps,” quick-actions grid, and the failure heatmap.</w:t>
-            </w:r>
-          </w:p>
-        </w:tc>
-      </w:tr>
-    </w:tbl>
-    <w:tbl>
-      <w:tblPr>
-        <w:tblW w:type="dxa" w:w="9026"/>
-        <w:tblBorders>
-          <w:top w:val="none" w:color="FFFFFF" w:sz="0"/>
-          <w:left w:val="none" w:color="FFFFFF" w:sz="0"/>
-          <w:bottom w:val="none" w:color="FFFFFF" w:sz="0"/>
-          <w:right w:val="none" w:color="FFFFFF" w:sz="0"/>
-          <w:insideH w:val="none" w:color="FFFFFF" w:sz="0"/>
-          <w:insideV w:val="none" w:color="FFFFFF" w:sz="0"/>
-        </w:tblBorders>
-      </w:tblPr>
-      <w:tblGrid>
-        <w:gridCol w:w="9026"/>
-      </w:tblGrid>
-      <w:tr>
-        <w:tc>
-          <w:tcPr>
-            <w:tcW w:type="dxa" w:w="9026"/>
-            <w:shd w:fill="E9FBF0" w:val="clear"/>
-            <w:tcMar>
-              <w:top w:type="dxa" w:w="90"/>
-              <w:left w:type="dxa" w:w="160"/>
-              <w:bottom w:type="dxa" w:w="90"/>
-              <w:right w:type="dxa" w:w="160"/>
-            </w:tcMar>
-          </w:tcPr>
-          <w:p>
-            <w:pPr>
-              <w:spacing w:after="0" w:line="264"/>
-            </w:pPr>
-            <w:r>
-              <w:rPr>
-                <w:b/>
-                <w:bCs/>
-                <w:caps/>
-                <w:color w:val="047857"/>
-                <w:sz w:val="18"/>
-                <w:szCs w:val="18"/>
-              </w:rPr>
-              <w:t xml:space="preserve">📷 Insert screenshot — Skills knowledge graph  </w:t>
-            </w:r>
-            <w:r>
-              <w:rPr>
-                <w:color w:val="1B2138"/>
-                <w:sz w:val="20"/>
-                <w:szCs w:val="20"/>
-              </w:rPr>
-              <w:t xml:space="preserve">/content/skills with a node selected, highlighting its up/downstream prerequisites — the graph the engine traverses.</w:t>
-            </w:r>
-          </w:p>
-        </w:tc>
-      </w:tr>
-    </w:tbl>
-    <w:tbl>
-      <w:tblPr>
-        <w:tblW w:type="dxa" w:w="9026"/>
-        <w:tblBorders>
-          <w:top w:val="none" w:color="FFFFFF" w:sz="0"/>
-          <w:left w:val="none" w:color="FFFFFF" w:sz="0"/>
-          <w:bottom w:val="none" w:color="FFFFFF" w:sz="0"/>
-          <w:right w:val="none" w:color="FFFFFF" w:sz="0"/>
-          <w:insideH w:val="none" w:color="FFFFFF" w:sz="0"/>
-          <w:insideV w:val="none" w:color="FFFFFF" w:sz="0"/>
-        </w:tblBorders>
-      </w:tblPr>
-      <w:tblGrid>
-        <w:gridCol w:w="9026"/>
-      </w:tblGrid>
-      <w:tr>
-        <w:tc>
-          <w:tcPr>
-            <w:tcW w:type="dxa" w:w="9026"/>
-            <w:shd w:fill="E9FBF0" w:val="clear"/>
-            <w:tcMar>
-              <w:top w:type="dxa" w:w="90"/>
-              <w:left w:type="dxa" w:w="160"/>
-              <w:bottom w:type="dxa" w:w="90"/>
-              <w:right w:type="dxa" w:w="160"/>
-            </w:tcMar>
-          </w:tcPr>
-          <w:p>
-            <w:pPr>
-              <w:spacing w:after="0" w:line="264"/>
-            </w:pPr>
-            <w:r>
-              <w:rPr>
-                <w:b/>
-                <w:bCs/>
-                <w:caps/>
-                <w:color w:val="047857"/>
-                <w:sz w:val="18"/>
-                <w:szCs w:val="18"/>
-              </w:rPr>
-              <w:t xml:space="preserve">🎥 Insert screen recording — Cohort analytics  </w:t>
-            </w:r>
-            <w:r>
-              <w:rPr>
-                <w:color w:val="1B2138"/>
-                <w:sz w:val="20"/>
-                <w:szCs w:val="20"/>
-              </w:rPr>
-              <w:t xml:space="preserve">/admin/analytics: hover the performance-trend line and error-type bars so the tooltips animate. ~15s.</w:t>
-            </w:r>
-          </w:p>
-        </w:tc>
-      </w:tr>
-    </w:tbl>
-    <w:p>
-      <w:r>
-        <w:br w:type="page"/>
-      </w:r>
-    </w:p>
-    <w:p>
-      <w:pPr>
-        <w:pStyle w:val="Heading1"/>
-        <w:spacing w:after="140" w:before="320"/>
-      </w:pPr>
-      <w:r>
-        <w:rPr>
-          <w:b/>
-          <w:bCs/>
-          <w:color w:val="4F46E5"/>
-          <w:sz w:val="30"/>
-          <w:szCs w:val="30"/>
-        </w:rPr>
-        <w:t xml:space="preserve">Phase 7 — The Database Manager</w:t>
-      </w:r>
-    </w:p>
-    <w:tbl>
-      <w:tblPr>
-        <w:tblW w:type="dxa" w:w="9026"/>
-        <w:tblBorders>
-          <w:top w:val="none" w:color="FFFFFF" w:sz="0"/>
-          <w:left w:val="none" w:color="FFFFFF" w:sz="0"/>
-          <w:bottom w:val="none" w:color="FFFFFF" w:sz="0"/>
-          <w:right w:val="none" w:color="FFFFFF" w:sz="0"/>
-          <w:insideH w:val="none" w:color="FFFFFF" w:sz="0"/>
-          <w:insideV w:val="none" w:color="FFFFFF" w:sz="0"/>
-        </w:tblBorders>
-      </w:tblPr>
-      <w:tblGrid>
-        <w:gridCol w:w="9026"/>
-      </w:tblGrid>
-      <w:tr>
-        <w:tc>
-          <w:tcPr>
-            <w:tcW w:type="dxa" w:w="9026"/>
-            <w:shd w:fill="EEF0FE" w:val="clear"/>
-            <w:tcMar>
-              <w:top w:type="dxa" w:w="90"/>
-              <w:left w:type="dxa" w:w="160"/>
-              <w:bottom w:type="dxa" w:w="90"/>
-              <w:right w:type="dxa" w:w="160"/>
-            </w:tcMar>
-          </w:tcPr>
-          <w:p>
-            <w:pPr>
-              <w:spacing w:after="0" w:line="264"/>
-            </w:pPr>
-            <w:r>
-              <w:rPr>
-                <w:b/>
-                <w:bCs/>
-                <w:caps/>
-                <w:color w:val="7C3AED"/>
-                <w:sz w:val="18"/>
-                <w:szCs w:val="18"/>
-              </w:rPr>
-              <w:t xml:space="preserve">Reasoning  </w:t>
-            </w:r>
-            <w:r>
-              <w:rPr>
-                <w:color w:val="1B2138"/>
-                <w:sz w:val="20"/>
-                <w:szCs w:val="20"/>
-              </w:rPr>
-              <w:t xml:space="preserve">Admins asked to “see and manage the entire database.” Rather than hard-code a CRUD page per table, a generic, schema-introspecting manager was built (src/lib/admin/db-admin.ts + /api/admin/db + /admin/database).</w:t>
-            </w:r>
-          </w:p>
-        </w:tc>
-      </w:tr>
-    </w:tbl>
-    <w:p>
-      <w:pPr>
-        <w:spacing w:after="60"/>
-      </w:pPr>
-      <w:r>
-        <w:rPr>
-          <w:sz w:val="8"/>
-          <w:szCs w:val="8"/>
-        </w:rPr>
-        <w:t xml:space="preserve"/>
-      </w:r>
-    </w:p>
-    <w:p>
-      <w:pPr>
-        <w:pStyle w:val="ListParagraph"/>
-        <w:numPr>
-          <w:ilvl w:val="0"/>
-          <w:numId w:val="2"/>
-        </w:numPr>
-        <w:spacing w:after="60" w:line="264"/>
-      </w:pPr>
-      <w:r>
-        <w:rPr>
-          <w:color w:val="1B2138"/>
-          <w:sz w:val="21"/>
-          <w:szCs w:val="21"/>
-        </w:rPr>
-        <w:t xml:space="preserve">List tables + live row counts (from sqlite_master + COUNT(*)).</w:t>
-      </w:r>
-    </w:p>
-    <w:p>
-      <w:pPr>
-        <w:pStyle w:val="ListParagraph"/>
-        <w:numPr>
-          <w:ilvl w:val="0"/>
-          <w:numId w:val="2"/>
-        </w:numPr>
-        <w:spacing w:after="60" w:line="264"/>
-      </w:pPr>
-      <w:r>
-        <w:rPr>
-          <w:color w:val="1B2138"/>
-          <w:sz w:val="21"/>
-          <w:szCs w:val="21"/>
-        </w:rPr>
-        <w:t xml:space="preserve">Per-table: paginated rows + full-text search (every column CAST(... AS TEXT) LIKE ?), inline edit and delete.</w:t>
-      </w:r>
-    </w:p>
-    <w:p>
-      <w:pPr>
-        <w:pStyle w:val="ListParagraph"/>
-        <w:numPr>
-          <w:ilvl w:val="0"/>
-          <w:numId w:val="2"/>
-        </w:numPr>
-        <w:spacing w:after="60" w:line="264"/>
-      </w:pPr>
-      <w:r>
-        <w:rPr>
-          <w:color w:val="1B2138"/>
-          <w:sz w:val="21"/>
-          <w:szCs w:val="21"/>
-        </w:rPr>
-        <w:t xml:space="preserve">Rows are addressed by SQLite’s implicit rowid, so edit/delete work uniformly even on composite-PK tables.</w:t>
-      </w:r>
-    </w:p>
-    <w:tbl>
-      <w:tblPr>
-        <w:tblW w:type="dxa" w:w="9026"/>
-        <w:tblBorders>
-          <w:top w:val="none" w:color="FFFFFF" w:sz="0"/>
-          <w:left w:val="none" w:color="FFFFFF" w:sz="0"/>
-          <w:bottom w:val="none" w:color="FFFFFF" w:sz="0"/>
-          <w:right w:val="none" w:color="FFFFFF" w:sz="0"/>
-          <w:insideH w:val="none" w:color="FFFFFF" w:sz="0"/>
-          <w:insideV w:val="none" w:color="FFFFFF" w:sz="0"/>
-        </w:tblBorders>
-      </w:tblPr>
-      <w:tblGrid>
-        <w:gridCol w:w="9026"/>
-      </w:tblGrid>
-      <w:tr>
-        <w:tc>
-          <w:tcPr>
-            <w:tcW w:type="dxa" w:w="9026"/>
-            <w:shd w:fill="EEF0FE" w:val="clear"/>
-            <w:tcMar>
-              <w:top w:type="dxa" w:w="90"/>
-              <w:left w:type="dxa" w:w="160"/>
-              <w:bottom w:type="dxa" w:w="90"/>
-              <w:right w:type="dxa" w:w="160"/>
-            </w:tcMar>
-          </w:tcPr>
-          <w:p>
-            <w:pPr>
-              <w:spacing w:after="0" w:line="264"/>
-            </w:pPr>
-            <w:r>
-              <w:rPr>
-                <w:b/>
-                <w:bCs/>
-                <w:caps/>
-                <w:color w:val="7C3AED"/>
-                <w:sz w:val="18"/>
-                <w:szCs w:val="18"/>
-              </w:rPr>
-              <w:t xml:space="preserve">Security — the critical part  </w:t>
-            </w:r>
-            <w:r>
-              <w:rPr>
-                <w:color w:val="1B2138"/>
-                <w:sz w:val="20"/>
-                <w:szCs w:val="20"/>
-              </w:rPr>
-              <w:t xml:space="preserve">Table and column identifiers are whitelist-validated against the live schema before touching SQL (an injected name like skills;DROP returns “Unknown table”); all values are bound as parameters, never interpolated; the whole area is Admin-only and every write is audit-logged (db.update_row / db.delete_row).</w:t>
-            </w:r>
-          </w:p>
-        </w:tc>
-      </w:tr>
-    </w:tbl>
-    <w:tbl>
-      <w:tblPr>
-        <w:tblW w:type="dxa" w:w="9026"/>
-        <w:tblBorders>
-          <w:top w:val="none" w:color="FFFFFF" w:sz="0"/>
-          <w:left w:val="none" w:color="FFFFFF" w:sz="0"/>
-          <w:bottom w:val="none" w:color="FFFFFF" w:sz="0"/>
-          <w:right w:val="none" w:color="FFFFFF" w:sz="0"/>
-          <w:insideH w:val="none" w:color="FFFFFF" w:sz="0"/>
-          <w:insideV w:val="none" w:color="FFFFFF" w:sz="0"/>
-        </w:tblBorders>
-      </w:tblPr>
-      <w:tblGrid>
-        <w:gridCol w:w="9026"/>
-      </w:tblGrid>
-      <w:tr>
-        <w:tc>
-          <w:tcPr>
-            <w:tcW w:type="dxa" w:w="9026"/>
-            <w:shd w:fill="FFF4E5" w:val="clear"/>
-            <w:tcMar>
-              <w:top w:type="dxa" w:w="90"/>
-              <w:left w:type="dxa" w:w="160"/>
-              <w:bottom w:type="dxa" w:w="90"/>
-              <w:right w:type="dxa" w:w="160"/>
-            </w:tcMar>
-          </w:tcPr>
-          <w:p>
-            <w:pPr>
-              <w:spacing w:after="0" w:line="264"/>
-            </w:pPr>
-            <w:r>
-              <w:rPr>
-                <w:b/>
-                <w:bCs/>
-                <w:caps/>
-                <w:color w:val="B45309"/>
-                <w:sz w:val="18"/>
-                <w:szCs w:val="18"/>
-              </w:rPr>
-              <w:t xml:space="preserve">⚠ Pitfall  </w:t>
-            </w:r>
-            <w:r>
-              <w:rPr>
-                <w:color w:val="1B2138"/>
-                <w:sz w:val="20"/>
-                <w:szCs w:val="20"/>
-              </w:rPr>
-              <w:t xml:space="preserve">An initial single-query optimization (UNION ALL over all tables) hit D1’s compound-SELECT term limit (SQLITE_ERROR: too many terms). Fix: reverted to concurrent per-table counts — correct and fast enough.</w:t>
-            </w:r>
-          </w:p>
-        </w:tc>
-      </w:tr>
-    </w:tbl>
-    <w:tbl>
-      <w:tblPr>
-        <w:tblW w:type="dxa" w:w="9026"/>
-        <w:tblBorders>
-          <w:top w:val="none" w:color="FFFFFF" w:sz="0"/>
-          <w:left w:val="none" w:color="FFFFFF" w:sz="0"/>
-          <w:bottom w:val="none" w:color="FFFFFF" w:sz="0"/>
-          <w:right w:val="none" w:color="FFFFFF" w:sz="0"/>
-          <w:insideH w:val="none" w:color="FFFFFF" w:sz="0"/>
-          <w:insideV w:val="none" w:color="FFFFFF" w:sz="0"/>
-        </w:tblBorders>
-      </w:tblPr>
-      <w:tblGrid>
-        <w:gridCol w:w="9026"/>
-      </w:tblGrid>
-      <w:tr>
-        <w:tc>
-          <w:tcPr>
-            <w:tcW w:type="dxa" w:w="9026"/>
-            <w:shd w:fill="E9FBF0" w:val="clear"/>
-            <w:tcMar>
-              <w:top w:type="dxa" w:w="90"/>
-              <w:left w:type="dxa" w:w="160"/>
-              <w:bottom w:type="dxa" w:w="90"/>
-              <w:right w:type="dxa" w:w="160"/>
-            </w:tcMar>
-          </w:tcPr>
-          <w:p>
-            <w:pPr>
-              <w:spacing w:after="0" w:line="264"/>
-            </w:pPr>
-            <w:r>
-              <w:rPr>
-                <w:b/>
-                <w:bCs/>
-                <w:caps/>
-                <w:color w:val="047857"/>
-                <w:sz w:val="18"/>
-                <w:szCs w:val="18"/>
-              </w:rPr>
-              <w:t xml:space="preserve">📷 Insert screenshot — Database manager  </w:t>
-            </w:r>
-            <w:r>
-              <w:rPr>
-                <w:color w:val="1B2138"/>
-                <w:sz w:val="20"/>
-                <w:szCs w:val="20"/>
-              </w:rPr>
-              <w:t xml:space="preserve">/admin/database with the questions table open: the left table list with counts, the row grid with the PK badge and edit/delete icons, and the search box.</w:t>
-            </w:r>
-          </w:p>
-        </w:tc>
-      </w:tr>
-    </w:tbl>
-    <w:p>
-      <w:r>
-        <w:br w:type="page"/>
-      </w:r>
-    </w:p>
-    <w:p>
-      <w:pPr>
-        <w:pStyle w:val="Heading1"/>
-        <w:spacing w:after="140" w:before="320"/>
-      </w:pPr>
-      <w:r>
-        <w:rPr>
-          <w:b/>
-          <w:bCs/>
-          <w:color w:val="4F46E5"/>
-          <w:sz w:val="30"/>
-          <w:szCs w:val="30"/>
-        </w:rPr>
-        <w:t xml:space="preserve">Phase 8 — Deployment to Cloudflare</w:t>
-      </w:r>
-    </w:p>
-    <w:tbl>
-      <w:tblPr>
-        <w:tblW w:type="dxa" w:w="9026"/>
-        <w:tblBorders>
-          <w:top w:val="none" w:color="FFFFFF" w:sz="0"/>
-          <w:left w:val="none" w:color="FFFFFF" w:sz="0"/>
-          <w:bottom w:val="none" w:color="FFFFFF" w:sz="0"/>
-          <w:right w:val="none" w:color="FFFFFF" w:sz="0"/>
-          <w:insideH w:val="none" w:color="FFFFFF" w:sz="0"/>
-          <w:insideV w:val="none" w:color="FFFFFF" w:sz="0"/>
-        </w:tblBorders>
-      </w:tblPr>
-      <w:tblGrid>
-        <w:gridCol w:w="9026"/>
-      </w:tblGrid>
-      <w:tr>
-        <w:tc>
-          <w:tcPr>
-            <w:tcW w:type="dxa" w:w="9026"/>
-            <w:shd w:fill="EEF0FE" w:val="clear"/>
-            <w:tcMar>
-              <w:top w:type="dxa" w:w="90"/>
-              <w:left w:type="dxa" w:w="160"/>
-              <w:bottom w:type="dxa" w:w="90"/>
-              <w:right w:type="dxa" w:w="160"/>
-            </w:tcMar>
-          </w:tcPr>
-          <w:p>
-            <w:pPr>
-              <w:spacing w:after="0" w:line="264"/>
-            </w:pPr>
-            <w:r>
-              <w:rPr>
-                <w:b/>
-                <w:bCs/>
-                <w:caps/>
-                <w:color w:val="7C3AED"/>
-                <w:sz w:val="18"/>
-                <w:szCs w:val="18"/>
-              </w:rPr>
-              <w:t xml:space="preserve">Reasoning  </w:t>
-            </w:r>
-            <w:r>
-              <w:rPr>
-                <w:color w:val="1B2138"/>
-                <w:sz w:val="20"/>
-                <w:szCs w:val="20"/>
-              </w:rPr>
-              <w:t xml:space="preserve">Production runs on the same primitives as dev (cloudflare:workers, D1), so there is no host-specific rewrite. The deploy is a fixed, repeatable sequence.</w:t>
-            </w:r>
-          </w:p>
-        </w:tc>
-      </w:tr>
-    </w:tbl>
-    <w:p>
-      <w:pPr>
-        <w:spacing w:after="60"/>
-      </w:pPr>
-      <w:r>
-        <w:rPr>
-          <w:sz w:val="8"/>
-          <w:szCs w:val="8"/>
-        </w:rPr>
-        <w:t xml:space="preserve"/>
-      </w:r>
-    </w:p>
-    <w:p>
-      <w:pPr>
-        <w:pStyle w:val="Heading3"/>
-        <w:spacing w:after="70" w:before="160"/>
-      </w:pPr>
-      <w:r>
-        <w:rPr>
-          <w:b/>
-          <w:bCs/>
-          <w:color w:val="334155"/>
-          <w:sz w:val="22"/>
-          <w:szCs w:val="22"/>
-        </w:rPr>
-        <w:t xml:space="preserve">One-time (per account)</w:t>
-      </w:r>
-    </w:p>
-    <w:p>
-      <w:pPr>
-        <w:pStyle w:val="ListParagraph"/>
-        <w:numPr>
-          <w:ilvl w:val="0"/>
-          <w:numId w:val="3"/>
-        </w:numPr>
-        <w:spacing w:after="60" w:line="264"/>
-      </w:pPr>
-      <w:r>
-        <w:rPr>
-          <w:rFonts w:ascii="Consolas" w:cs="Consolas" w:eastAsia="Consolas" w:hAnsi="Consolas"/>
-          <w:color w:val="334155"/>
-          <w:sz w:val="19"/>
-          <w:szCs w:val="19"/>
-        </w:rPr>
-        <w:t xml:space="preserve">npx wrangler login</w:t>
-      </w:r>
-      <w:r>
-        <w:t xml:space="preserve"> (browser OAuth — a human step; not automatable).</w:t>
-      </w:r>
-    </w:p>
-    <w:p>
-      <w:pPr>
-        <w:pStyle w:val="ListParagraph"/>
-        <w:numPr>
-          <w:ilvl w:val="0"/>
-          <w:numId w:val="3"/>
-        </w:numPr>
-        <w:spacing w:after="60" w:line="264"/>
-      </w:pPr>
-      <w:r>
-        <w:rPr>
-          <w:rFonts w:ascii="Consolas" w:cs="Consolas" w:eastAsia="Consolas" w:hAnsi="Consolas"/>
-          <w:color w:val="334155"/>
-          <w:sz w:val="19"/>
-          <w:szCs w:val="19"/>
-        </w:rPr>
-        <w:t xml:space="preserve">npx wrangler d1 create zarban</w:t>
-      </w:r>
-      <w:r>
-        <w:t xml:space="preserve"> → capture the printed database_id.</w:t>
-      </w:r>
-    </w:p>
-    <w:p>
-      <w:pPr>
-        <w:pStyle w:val="ListParagraph"/>
-        <w:numPr>
-          <w:ilvl w:val="0"/>
-          <w:numId w:val="3"/>
-        </w:numPr>
-        <w:spacing w:after="60" w:line="264"/>
-      </w:pPr>
-      <w:r>
-        <w:rPr>
-          <w:rFonts w:ascii="Consolas" w:cs="Consolas" w:eastAsia="Consolas" w:hAnsi="Consolas"/>
-          <w:color w:val="334155"/>
-          <w:sz w:val="19"/>
-          <w:szCs w:val="19"/>
-        </w:rPr>
-        <w:t xml:space="preserve">npx wrangler d1 execute zarban --remote --file=drizzle/0000_initial.sql -y</w:t>
-      </w:r>
-      <w:r>
-        <w:t xml:space="preserve"> (result: 6,447 queries, ~19,305 rows, 20 tables).</w:t>
-      </w:r>
-    </w:p>
-    <w:p>
-      <w:pPr>
-        <w:pStyle w:val="Heading3"/>
-        <w:spacing w:after="70" w:before="160"/>
-      </w:pPr>
-      <w:r>
-        <w:rPr>
-          <w:b/>
-          <w:bCs/>
-          <w:color w:val="334155"/>
-          <w:sz w:val="22"/>
-          <w:szCs w:val="22"/>
-        </w:rPr>
-        <w:t xml:space="preserve">Every deploy</w:t>
-      </w:r>
-    </w:p>
-    <w:p>
-      <w:pPr>
-        <w:pStyle w:val="ListParagraph"/>
-        <w:numPr>
-          <w:ilvl w:val="0"/>
-          <w:numId w:val="3"/>
-        </w:numPr>
-        <w:spacing w:after="60" w:line="264"/>
-      </w:pPr>
-      <w:r>
-        <w:rPr>
-          <w:rFonts w:ascii="Consolas" w:cs="Consolas" w:eastAsia="Consolas" w:hAnsi="Consolas"/>
-          <w:color w:val="334155"/>
-          <w:sz w:val="19"/>
-          <w:szCs w:val="19"/>
-        </w:rPr>
-        <w:t xml:space="preserve">npm run build</w:t>
-      </w:r>
-      <w:r>
-        <w:t xml:space="preserve"> (regenerates dist/server/ and dist/server/wrangler.json).</w:t>
-      </w:r>
-    </w:p>
-    <w:p>
-      <w:pPr>
-        <w:pStyle w:val="ListParagraph"/>
-        <w:numPr>
-          <w:ilvl w:val="0"/>
-          <w:numId w:val="3"/>
-        </w:numPr>
-        <w:spacing w:after="60" w:line="264"/>
-      </w:pPr>
-      <w:r>
-        <w:rPr>
-          <w:rFonts w:ascii="Consolas" w:cs="Consolas" w:eastAsia="Consolas" w:hAnsi="Consolas"/>
-          <w:color w:val="334155"/>
-          <w:sz w:val="19"/>
-          <w:szCs w:val="19"/>
-        </w:rPr>
-        <w:t xml:space="preserve">node scripts/patch-d1.mjs &lt;database_id&gt;</w:t>
-      </w:r>
-      <w:r>
-        <w:t xml:space="preserve"> — writes the D1 binding into the freshly-built config, so no one hand-edits generated JSON.</w:t>
-      </w:r>
-    </w:p>
-    <w:p>
-      <w:pPr>
-        <w:pStyle w:val="ListParagraph"/>
-        <w:numPr>
-          <w:ilvl w:val="0"/>
-          <w:numId w:val="3"/>
-        </w:numPr>
-        <w:spacing w:after="60" w:line="264"/>
-      </w:pPr>
-      <w:r>
-        <w:rPr>
-          <w:rFonts w:ascii="Consolas" w:cs="Consolas" w:eastAsia="Consolas" w:hAnsi="Consolas"/>
-          <w:color w:val="334155"/>
-          <w:sz w:val="19"/>
-          <w:szCs w:val="19"/>
-        </w:rPr>
-        <w:t xml:space="preserve">npx wrangler deploy</w:t>
-      </w:r>
-      <w:r>
-        <w:t xml:space="preserve"> — run from the repo root, not dist/server/.</w:t>
-      </w:r>
-    </w:p>
-    <w:p>
-      <w:pPr>
-        <w:pStyle w:val="Heading3"/>
-        <w:spacing w:after="70" w:before="160"/>
-      </w:pPr>
-      <w:r>
-        <w:rPr>
-          <w:b/>
-          <w:bCs/>
-          <w:color w:val="334155"/>
-          <w:sz w:val="22"/>
-          <w:szCs w:val="22"/>
-        </w:rPr>
-        <w:t xml:space="preserve">Post-deploy hardening</w:t>
-      </w:r>
-    </w:p>
-    <w:p>
-      <w:pPr>
-        <w:pStyle w:val="ListParagraph"/>
-        <w:numPr>
-          <w:ilvl w:val="0"/>
-          <w:numId w:val="3"/>
-        </w:numPr>
-        <w:spacing w:after="60" w:line="264"/>
-      </w:pPr>
-      <w:r>
-        <w:rPr>
-          <w:rFonts w:ascii="Consolas" w:cs="Consolas" w:eastAsia="Consolas" w:hAnsi="Consolas"/>
-          <w:color w:val="334155"/>
-          <w:sz w:val="19"/>
-          <w:szCs w:val="19"/>
-        </w:rPr>
-        <w:t xml:space="preserve">wrangler secret put AUTH_SECRET</w:t>
-      </w:r>
-      <w:r>
-        <w:t xml:space="preserve"> — replace the dev-fallback JWT secret (piped a 48-byte random value; never printed).</w:t>
-      </w:r>
-    </w:p>
-    <w:p>
-      <w:pPr>
-        <w:pStyle w:val="Heading3"/>
-        <w:spacing w:after="70" w:before="160"/>
-      </w:pPr>
-      <w:r>
-        <w:rPr>
-          <w:b/>
-          <w:bCs/>
-          <w:color w:val="334155"/>
-          <w:sz w:val="22"/>
-          <w:szCs w:val="22"/>
-        </w:rPr>
-        <w:t xml:space="preserve">Pitfalls solved during the real deployment</w:t>
-      </w:r>
-    </w:p>
-    <w:p>
-      <w:pPr>
-        <w:pStyle w:val="ListParagraph"/>
-        <w:numPr>
-          <w:ilvl w:val="0"/>
-          <w:numId w:val="2"/>
-        </w:numPr>
-        <w:spacing w:after="60" w:line="264"/>
-      </w:pPr>
-      <w:r>
-        <w:rPr>
-          <w:b/>
-          <w:bCs/>
-        </w:rPr>
-        <w:t xml:space="preserve">Deploy config collision: </w:t>
-      </w:r>
-      <w:r>
-        <w:t xml:space="preserve">running deploy from dist/server/ errors (“Found both a user configuration file… and a deploy configuration file…”). Fix: deploy from repo root.</w:t>
-      </w:r>
-    </w:p>
-    <w:p>
-      <w:pPr>
-        <w:pStyle w:val="ListParagraph"/>
-        <w:numPr>
-          <w:ilvl w:val="0"/>
-          <w:numId w:val="2"/>
-        </w:numPr>
-        <w:spacing w:after="60" w:line="264"/>
-      </w:pPr>
-      <w:r>
-        <w:rPr>
-          <w:b/>
-          <w:bCs/>
-        </w:rPr>
-        <w:t xml:space="preserve">Cold-start transients: </w:t>
-      </w:r>
-      <w:r>
-        <w:t xml:space="preserve">the first ~30s returns sporadic 404/1042. Fix: warmup; a route-sweep once warm confirms all 200.</w:t>
-      </w:r>
-    </w:p>
-    <w:p>
-      <w:pPr>
-        <w:pStyle w:val="ListParagraph"/>
-        <w:numPr>
-          <w:ilvl w:val="0"/>
-          <w:numId w:val="2"/>
-        </w:numPr>
-        <w:spacing w:after="60" w:line="264"/>
-      </w:pPr>
-      <w:r>
-        <w:rPr>
-          <w:b/>
-          <w:bCs/>
-        </w:rPr>
-        <w:t xml:space="preserve">workers.dev subdomain: </w:t>
-      </w:r>
-      <w:r>
-        <w:t xml:space="preserve">the auto-assigned subdomain can’t be renamed via API (error 10036) — dashboard-only, one-time. Custom domain needs a zone on the account (verified 0 zones ⇒ needs registration first).</w:t>
-      </w:r>
-    </w:p>
-    <w:p>
-      <w:pPr>
-        <w:pStyle w:val="ListParagraph"/>
-        <w:numPr>
-          <w:ilvl w:val="0"/>
-          <w:numId w:val="2"/>
-        </w:numPr>
-        <w:spacing w:after="60" w:line="264"/>
-      </w:pPr>
-      <w:r>
-        <w:rPr>
-          <w:b/>
-          <w:bCs/>
-        </w:rPr>
-        <w:t xml:space="preserve">Fresh subdomain SSL: </w:t>
-      </w:r>
-      <w:r>
-        <w:t xml:space="preserve">after a subdomain change, HTTP served instantly but HTTPS failed the TLS handshake (curl exit 35) for a few minutes while Cloudflare issued the cert. Fix: poll until it lands.</w:t>
-      </w:r>
-    </w:p>
-    <w:tbl>
-      <w:tblPr>
-        <w:tblW w:type="dxa" w:w="9026"/>
-        <w:tblBorders>
-          <w:top w:val="none" w:color="FFFFFF" w:sz="0"/>
-          <w:left w:val="none" w:color="FFFFFF" w:sz="0"/>
-          <w:bottom w:val="none" w:color="FFFFFF" w:sz="0"/>
-          <w:right w:val="none" w:color="FFFFFF" w:sz="0"/>
-          <w:insideH w:val="none" w:color="FFFFFF" w:sz="0"/>
-          <w:insideV w:val="none" w:color="FFFFFF" w:sz="0"/>
-        </w:tblBorders>
-      </w:tblPr>
-      <w:tblGrid>
-        <w:gridCol w:w="9026"/>
-      </w:tblGrid>
-      <w:tr>
-        <w:tc>
-          <w:tcPr>
-            <w:tcW w:type="dxa" w:w="9026"/>
-            <w:shd w:fill="E9FBF0" w:val="clear"/>
-            <w:tcMar>
-              <w:top w:type="dxa" w:w="90"/>
-              <w:left w:type="dxa" w:w="160"/>
-              <w:bottom w:type="dxa" w:w="90"/>
-              <w:right w:type="dxa" w:w="160"/>
-            </w:tcMar>
-          </w:tcPr>
-          <w:p>
-            <w:pPr>
-              <w:spacing w:after="0" w:line="264"/>
-            </w:pPr>
-            <w:r>
-              <w:rPr>
-                <w:b/>
-                <w:bCs/>
-                <w:caps/>
-                <w:color w:val="047857"/>
-                <w:sz w:val="18"/>
-                <w:szCs w:val="18"/>
-              </w:rPr>
-              <w:t xml:space="preserve">📷 Insert screenshot — wrangler deploy  </w:t>
-            </w:r>
-            <w:r>
-              <w:rPr>
-                <w:color w:val="1B2138"/>
-                <w:sz w:val="20"/>
-                <w:szCs w:val="20"/>
-              </w:rPr>
-              <w:t xml:space="preserve">Terminal output: “Uploaded zarban,” “env.DB (zarban) D1 Database,” the live workers.dev URL, and the Version ID.</w:t>
-            </w:r>
-          </w:p>
-        </w:tc>
-      </w:tr>
-    </w:tbl>
-    <w:tbl>
-      <w:tblPr>
-        <w:tblW w:type="dxa" w:w="9026"/>
-        <w:tblBorders>
-          <w:top w:val="none" w:color="FFFFFF" w:sz="0"/>
-          <w:left w:val="none" w:color="FFFFFF" w:sz="0"/>
-          <w:bottom w:val="none" w:color="FFFFFF" w:sz="0"/>
-          <w:right w:val="none" w:color="FFFFFF" w:sz="0"/>
-          <w:insideH w:val="none" w:color="FFFFFF" w:sz="0"/>
-          <w:insideV w:val="none" w:color="FFFFFF" w:sz="0"/>
-        </w:tblBorders>
-      </w:tblPr>
-      <w:tblGrid>
-        <w:gridCol w:w="9026"/>
-      </w:tblGrid>
-      <w:tr>
-        <w:tc>
-          <w:tcPr>
-            <w:tcW w:type="dxa" w:w="9026"/>
-            <w:shd w:fill="E9FBF0" w:val="clear"/>
-            <w:tcMar>
-              <w:top w:type="dxa" w:w="90"/>
-              <w:left w:type="dxa" w:w="160"/>
-              <w:bottom w:type="dxa" w:w="90"/>
-              <w:right w:type="dxa" w:w="160"/>
-            </w:tcMar>
-          </w:tcPr>
-          <w:p>
-            <w:pPr>
-              <w:spacing w:after="0" w:line="264"/>
-            </w:pPr>
-            <w:r>
-              <w:rPr>
-                <w:b/>
-                <w:bCs/>
-                <w:caps/>
-                <w:color w:val="047857"/>
-                <w:sz w:val="18"/>
-                <w:szCs w:val="18"/>
-              </w:rPr>
-              <w:t xml:space="preserve">📷 Insert screenshot — D1 import result  </w:t>
-            </w:r>
-            <w:r>
-              <w:rPr>
-                <w:color w:val="1B2138"/>
-                <w:sz w:val="20"/>
-                <w:szCs w:val="20"/>
-              </w:rPr>
-              <w:t xml:space="preserve">The d1 execute --file summary: “6,447 queries,” “19,305 rows written,” “20 tables” — proof the remote DB was seeded.</w:t>
-            </w:r>
-          </w:p>
-        </w:tc>
-      </w:tr>
-    </w:tbl>
-    <w:tbl>
-      <w:tblPr>
-        <w:tblW w:type="dxa" w:w="9026"/>
-        <w:tblBorders>
-          <w:top w:val="none" w:color="FFFFFF" w:sz="0"/>
-          <w:left w:val="none" w:color="FFFFFF" w:sz="0"/>
-          <w:bottom w:val="none" w:color="FFFFFF" w:sz="0"/>
-          <w:right w:val="none" w:color="FFFFFF" w:sz="0"/>
-          <w:insideH w:val="none" w:color="FFFFFF" w:sz="0"/>
-          <w:insideV w:val="none" w:color="FFFFFF" w:sz="0"/>
-        </w:tblBorders>
-      </w:tblPr>
-      <w:tblGrid>
-        <w:gridCol w:w="9026"/>
-      </w:tblGrid>
-      <w:tr>
-        <w:tc>
-          <w:tcPr>
-            <w:tcW w:type="dxa" w:w="9026"/>
-            <w:shd w:fill="E9FBF0" w:val="clear"/>
-            <w:tcMar>
-              <w:top w:type="dxa" w:w="90"/>
-              <w:left w:type="dxa" w:w="160"/>
-              <w:bottom w:type="dxa" w:w="90"/>
-              <w:right w:type="dxa" w:w="160"/>
-            </w:tcMar>
-          </w:tcPr>
-          <w:p>
-            <w:pPr>
-              <w:spacing w:after="0" w:line="264"/>
-            </w:pPr>
-            <w:r>
-              <w:rPr>
-                <w:b/>
-                <w:bCs/>
-                <w:caps/>
-                <w:color w:val="047857"/>
-                <w:sz w:val="18"/>
-                <w:szCs w:val="18"/>
-              </w:rPr>
-              <w:t xml:space="preserve">🎥 Insert screen recording — End-to-end deploy  </w:t>
-            </w:r>
-            <w:r>
-              <w:rPr>
-                <w:color w:val="1B2138"/>
-                <w:sz w:val="20"/>
-                <w:szCs w:val="20"/>
-              </w:rPr>
-              <w:t xml:space="preserve">build → patch-d1 → deploy, then a browser hit of the live URL. ~90s. The definitive “it ships” artifact.</w:t>
-            </w:r>
-          </w:p>
-        </w:tc>
-      </w:tr>
-    </w:tbl>
-    <w:p>
-      <w:r>
-        <w:br w:type="page"/>
-      </w:r>
-    </w:p>
-    <w:p>
-      <w:pPr>
-        <w:pStyle w:val="Heading1"/>
-        <w:spacing w:after="140" w:before="320"/>
-      </w:pPr>
-      <w:r>
-        <w:rPr>
-          <w:b/>
-          <w:bCs/>
-          <w:color w:val="4F46E5"/>
-          <w:sz w:val="30"/>
-          <w:szCs w:val="30"/>
-        </w:rPr>
-        <w:t xml:space="preserve">Phase 9 — Performance Optimization</w:t>
-      </w:r>
-    </w:p>
-    <w:tbl>
-      <w:tblPr>
-        <w:tblW w:type="dxa" w:w="9026"/>
-        <w:tblBorders>
-          <w:top w:val="none" w:color="FFFFFF" w:sz="0"/>
-          <w:left w:val="none" w:color="FFFFFF" w:sz="0"/>
-          <w:bottom w:val="none" w:color="FFFFFF" w:sz="0"/>
-          <w:right w:val="none" w:color="FFFFFF" w:sz="0"/>
-          <w:insideH w:val="none" w:color="FFFFFF" w:sz="0"/>
-          <w:insideV w:val="none" w:color="FFFFFF" w:sz="0"/>
-        </w:tblBorders>
-      </w:tblPr>
-      <w:tblGrid>
-        <w:gridCol w:w="9026"/>
-      </w:tblGrid>
-      <w:tr>
-        <w:tc>
-          <w:tcPr>
-            <w:tcW w:type="dxa" w:w="9026"/>
-            <w:shd w:fill="EEF0FE" w:val="clear"/>
-            <w:tcMar>
-              <w:top w:type="dxa" w:w="90"/>
-              <w:left w:type="dxa" w:w="160"/>
-              <w:bottom w:type="dxa" w:w="90"/>
-              <w:right w:type="dxa" w:w="160"/>
-            </w:tcMar>
-          </w:tcPr>
-          <w:p>
-            <w:pPr>
-              <w:spacing w:after="0" w:line="264"/>
-            </w:pPr>
-            <w:r>
-              <w:rPr>
-                <w:b/>
-                <w:bCs/>
-                <w:caps/>
-                <w:color w:val="7C3AED"/>
-                <w:sz w:val="18"/>
-                <w:szCs w:val="18"/>
-              </w:rPr>
-              <w:t xml:space="preserve">Reasoning  </w:t>
-            </w:r>
-            <w:r>
-              <w:rPr>
-                <w:color w:val="1B2138"/>
-                <w:sz w:val="20"/>
-                <w:szCs w:val="20"/>
-              </w:rPr>
-              <w:t xml:space="preserve">On Cloudflare D1, each query is a network round trip, so per-request round-trip count — not slow scans (indexes were already in place) — dominates latency. The optimization was measured, not guessed.</w:t>
-            </w:r>
-          </w:p>
-        </w:tc>
-      </w:tr>
-    </w:tbl>
-    <w:p>
-      <w:pPr>
-        <w:spacing w:after="60"/>
-      </w:pPr>
-      <w:r>
-        <w:rPr>
-          <w:sz w:val="8"/>
-          <w:szCs w:val="8"/>
-        </w:rPr>
-        <w:t xml:space="preserve"/>
-      </w:r>
-    </w:p>
-    <w:p>
-      <w:pPr>
-        <w:pStyle w:val="Heading2"/>
-        <w:spacing w:after="90" w:before="220"/>
-      </w:pPr>
-      <w:r>
-        <w:rPr>
-          <w:b/>
-          <w:bCs/>
-          <w:color w:val="1B2138"/>
-          <w:sz w:val="25"/>
-          <w:szCs w:val="25"/>
-        </w:rPr>
-        <w:t xml:space="preserve">9.1 Method</w:t>
-      </w:r>
-    </w:p>
-    <w:p>
-      <w:pPr>
-        <w:pStyle w:val="ListParagraph"/>
-        <w:numPr>
-          <w:ilvl w:val="0"/>
-          <w:numId w:val="2"/>
-        </w:numPr>
-        <w:spacing w:after="60" w:line="264"/>
-      </w:pPr>
-      <w:r>
-        <w:rPr>
-          <w:color w:val="1B2138"/>
-          <w:sz w:val="21"/>
-          <w:szCs w:val="21"/>
-        </w:rPr>
-        <w:t xml:space="preserve">A benchmark runs a real assessment against production and times each POST /api/session/respond, plus a sweep of every read endpoint.</w:t>
-      </w:r>
-    </w:p>
-    <w:p>
-      <w:pPr>
-        <w:pStyle w:val="ListParagraph"/>
-        <w:numPr>
-          <w:ilvl w:val="0"/>
-          <w:numId w:val="2"/>
-        </w:numPr>
-        <w:spacing w:after="60" w:line="264"/>
-      </w:pPr>
-      <w:r>
-        <w:rPr>
-          <w:color w:val="1B2138"/>
-          <w:sz w:val="21"/>
-          <w:szCs w:val="21"/>
-        </w:rPr>
-        <w:t xml:space="preserve">Baseline: ~16–18 sequential D1 queries per answer; median respond ~480–610 ms; a fixed 350 ms client pre-submit delay on top.</w:t>
-      </w:r>
-    </w:p>
-    <w:p>
-      <w:pPr>
-        <w:pStyle w:val="Heading2"/>
-        <w:spacing w:after="90" w:before="220"/>
-      </w:pPr>
-      <w:r>
-        <w:rPr>
-          <w:b/>
-          <w:bCs/>
-          <w:color w:val="1B2138"/>
-          <w:sz w:val="25"/>
-          <w:szCs w:val="25"/>
-        </w:rPr>
-        <w:t xml:space="preserve">9.2 Changes (behaviour-preserving — all 136 e2e checks still pass)</w:t>
-      </w:r>
-    </w:p>
-    <w:p>
-      <w:pPr>
-        <w:pStyle w:val="ListParagraph"/>
-        <w:numPr>
-          <w:ilvl w:val="0"/>
-          <w:numId w:val="2"/>
-        </w:numPr>
-        <w:spacing w:after="60" w:line="264"/>
-      </w:pPr>
-      <w:r>
-        <w:rPr>
-          <w:color w:val="1B2138"/>
-          <w:sz w:val="21"/>
-          <w:szCs w:val="21"/>
-        </w:rPr>
-        <w:t xml:space="preserve">Parallelized independent reads with Promise.all (session+question; then trap+BKT-state+history).</w:t>
-      </w:r>
-    </w:p>
-    <w:p>
-      <w:pPr>
-        <w:pStyle w:val="ListParagraph"/>
-        <w:numPr>
-          <w:ilvl w:val="0"/>
-          <w:numId w:val="2"/>
-        </w:numPr>
-        <w:spacing w:after="60" w:line="264"/>
-      </w:pPr>
-      <w:r>
-        <w:rPr>
-          <w:color w:val="1B2138"/>
-          <w:sz w:val="21"/>
-          <w:szCs w:val="21"/>
-        </w:rPr>
-        <w:t xml:space="preserve">Removed a redundant re-read of the session — used the update() return value; ran the two writes concurrently.</w:t>
-      </w:r>
-    </w:p>
-    <w:p>
-      <w:pPr>
-        <w:pStyle w:val="ListParagraph"/>
-        <w:numPr>
-          <w:ilvl w:val="0"/>
-          <w:numId w:val="2"/>
-        </w:numPr>
-        <w:spacing w:after="60" w:line="264"/>
-      </w:pPr>
-      <w:r>
-        <w:rPr>
-          <w:color w:val="1B2138"/>
-          <w:sz w:val="21"/>
-          <w:szCs w:val="21"/>
-        </w:rPr>
-        <w:t xml:space="preserve">Introduced an in-isolate TTL cache (src/lib/engine/cache.ts) for near-static data (all skills, the knowledge graph, settings, the cross-session “seen” set); admin settings writes invalidate it.</w:t>
-      </w:r>
-    </w:p>
-    <w:p>
-      <w:pPr>
-        <w:pStyle w:val="ListParagraph"/>
-        <w:numPr>
-          <w:ilvl w:val="0"/>
-          <w:numId w:val="2"/>
-        </w:numPr>
-        <w:spacing w:after="60" w:line="264"/>
-      </w:pPr>
-      <w:r>
-        <w:rPr>
-          <w:color w:val="1B2138"/>
-          <w:sz w:val="21"/>
-          <w:szCs w:val="21"/>
-        </w:rPr>
-        <w:t xml:space="preserve">Trimmed the growing history query to only the columns the engine consumes.</w:t>
-      </w:r>
-    </w:p>
-    <w:p>
-      <w:pPr>
-        <w:pStyle w:val="ListParagraph"/>
-        <w:numPr>
-          <w:ilvl w:val="0"/>
-          <w:numId w:val="2"/>
-        </w:numPr>
-        <w:spacing w:after="60" w:line="264"/>
-      </w:pPr>
-      <w:r>
-        <w:rPr>
-          <w:color w:val="1B2138"/>
-          <w:sz w:val="21"/>
-          <w:szCs w:val="21"/>
-        </w:rPr>
-        <w:t xml:space="preserve">Skipped the “all skills mastered?” probe on wrong answers (mastery can’t rise).</w:t>
-      </w:r>
-    </w:p>
-    <w:p>
-      <w:pPr>
-        <w:pStyle w:val="ListParagraph"/>
-        <w:numPr>
-          <w:ilvl w:val="0"/>
-          <w:numId w:val="2"/>
-        </w:numPr>
-        <w:spacing w:after="60" w:line="264"/>
-      </w:pPr>
-      <w:r>
-        <w:rPr>
-          <w:color w:val="1B2138"/>
-          <w:sz w:val="21"/>
-          <w:szCs w:val="21"/>
-        </w:rPr>
-        <w:t xml:space="preserve">Client: submit immediately and overlap the 350 ms “choice-visible” beat with the network round trip.</w:t>
-      </w:r>
-    </w:p>
-    <w:p>
-      <w:pPr>
-        <w:pStyle w:val="ListParagraph"/>
-        <w:numPr>
-          <w:ilvl w:val="0"/>
-          <w:numId w:val="2"/>
-        </w:numPr>
-        <w:spacing w:after="60" w:line="264"/>
-      </w:pPr>
-      <w:r>
-        <w:rPr>
-          <w:color w:val="1B2138"/>
-          <w:sz w:val="21"/>
-          <w:szCs w:val="21"/>
-        </w:rPr>
-        <w:t xml:space="preserve">Applied the same treatment to the dashboard, content hub, and report endpoints.</w:t>
-      </w:r>
-    </w:p>
-    <w:tbl>
-      <w:tblPr>
-        <w:tblW w:type="dxa" w:w="9026"/>
-        <w:tblBorders>
-          <w:top w:val="none" w:color="FFFFFF" w:sz="0"/>
-          <w:left w:val="none" w:color="FFFFFF" w:sz="0"/>
-          <w:bottom w:val="none" w:color="FFFFFF" w:sz="0"/>
-          <w:right w:val="none" w:color="FFFFFF" w:sz="0"/>
-          <w:insideH w:val="none" w:color="FFFFFF" w:sz="0"/>
-          <w:insideV w:val="none" w:color="FFFFFF" w:sz="0"/>
-        </w:tblBorders>
-      </w:tblPr>
-      <w:tblGrid>
-        <w:gridCol w:w="9026"/>
-      </w:tblGrid>
-      <w:tr>
-        <w:tc>
-          <w:tcPr>
-            <w:tcW w:type="dxa" w:w="9026"/>
-            <w:shd w:fill="E9FBF0" w:val="clear"/>
-            <w:tcMar>
-              <w:top w:type="dxa" w:w="90"/>
-              <w:left w:type="dxa" w:w="160"/>
-              <w:bottom w:type="dxa" w:w="90"/>
-              <w:right w:type="dxa" w:w="160"/>
-            </w:tcMar>
-          </w:tcPr>
-          <w:p>
-            <w:pPr>
-              <w:spacing w:after="0" w:line="264"/>
-            </w:pPr>
-            <w:r>
-              <w:rPr>
-                <w:b/>
-                <w:bCs/>
-                <w:caps/>
-                <w:color w:val="047857"/>
-                <w:sz w:val="18"/>
-                <w:szCs w:val="18"/>
-              </w:rPr>
-              <w:t xml:space="preserve">📷 Insert screenshot — Benchmark before/after  </w:t>
-            </w:r>
-            <w:r>
-              <w:rPr>
-                <w:color w:val="1B2138"/>
-                <w:sz w:val="20"/>
-                <w:szCs w:val="20"/>
-              </w:rPr>
-              <w:t xml:space="preserve">Two terminal captures of the benchmark side by side: baseline medians vs. optimized medians.</w:t>
-            </w:r>
-          </w:p>
-        </w:tc>
-      </w:tr>
-    </w:tbl>
-    <w:p>
-      <w:r>
-        <w:br w:type="page"/>
-      </w:r>
-    </w:p>
-    <w:p>
-      <w:pPr>
-        <w:pStyle w:val="Heading1"/>
-        <w:spacing w:after="140" w:before="320"/>
-      </w:pPr>
-      <w:r>
-        <w:rPr>
-          <w:b/>
-          <w:bCs/>
-          <w:color w:val="4F46E5"/>
-          <w:sz w:val="30"/>
-          <w:szCs w:val="30"/>
-        </w:rPr>
-        <w:t xml:space="preserve">Phase 10 — Testing &amp; Verification</w:t>
-      </w:r>
-    </w:p>
-    <w:p>
-      <w:pPr>
-        <w:pStyle w:val="ListParagraph"/>
-        <w:numPr>
-          <w:ilvl w:val="0"/>
-          <w:numId w:val="2"/>
-        </w:numPr>
-        <w:spacing w:after="60" w:line="264"/>
-      </w:pPr>
-      <w:r>
-        <w:rPr>
-          <w:rFonts w:ascii="Consolas" w:cs="Consolas" w:eastAsia="Consolas" w:hAnsi="Consolas"/>
-          <w:color w:val="334155"/>
-          <w:sz w:val="19"/>
-          <w:szCs w:val="19"/>
-        </w:rPr>
-        <w:t xml:space="preserve">scripts/e2e.ts</w:t>
-      </w:r>
-      <w:r>
-        <w:t xml:space="preserve"> (npm run e2e) — 136 end-to-end checks driving the real HTTP API: the full assessment lifecycle, report + analysis, admin auth and every admin view, the content portal, and RBAC denial (viewer gets 403 on privileged routes). Correct answers are read from the local D1 so both all-correct and all-wrong runs can be asserted.</w:t>
-      </w:r>
-    </w:p>
-    <w:p>
-      <w:pPr>
-        <w:pStyle w:val="ListParagraph"/>
-        <w:numPr>
-          <w:ilvl w:val="0"/>
-          <w:numId w:val="2"/>
-        </w:numPr>
-        <w:spacing w:after="60" w:line="264"/>
-      </w:pPr>
-      <w:r>
-        <w:rPr>
-          <w:rFonts w:ascii="Consolas" w:cs="Consolas" w:eastAsia="Consolas" w:hAnsi="Consolas"/>
-          <w:color w:val="334155"/>
-          <w:sz w:val="19"/>
-          <w:szCs w:val="19"/>
-        </w:rPr>
-        <w:t xml:space="preserve">npx tsc --noEmit</w:t>
-      </w:r>
-      <w:r>
-        <w:t xml:space="preserve"> gates every change.</w:t>
-      </w:r>
-    </w:p>
-    <w:p>
-      <w:pPr>
-        <w:pStyle w:val="ListParagraph"/>
-        <w:numPr>
-          <w:ilvl w:val="0"/>
-          <w:numId w:val="2"/>
-        </w:numPr>
-        <w:spacing w:after="60" w:line="264"/>
-      </w:pPr>
-      <w:r>
-        <w:rPr>
-          <w:b/>
-          <w:bCs/>
-        </w:rPr>
-        <w:t xml:space="preserve">Browser verification </w:t>
-      </w:r>
-      <w:r>
-        <w:t xml:space="preserve">via the accessibility tree / DOM and console; production screenshots for docs are captured with headless Chrome (authenticated pages driven via the DevTools Protocol with the admin cookie).</w:t>
-      </w:r>
-    </w:p>
-    <w:tbl>
-      <w:tblPr>
-        <w:tblW w:type="dxa" w:w="9026"/>
-        <w:tblBorders>
-          <w:top w:val="none" w:color="FFFFFF" w:sz="0"/>
-          <w:left w:val="none" w:color="FFFFFF" w:sz="0"/>
-          <w:bottom w:val="none" w:color="FFFFFF" w:sz="0"/>
-          <w:right w:val="none" w:color="FFFFFF" w:sz="0"/>
-          <w:insideH w:val="none" w:color="FFFFFF" w:sz="0"/>
-          <w:insideV w:val="none" w:color="FFFFFF" w:sz="0"/>
-        </w:tblBorders>
-      </w:tblPr>
-      <w:tblGrid>
-        <w:gridCol w:w="9026"/>
-      </w:tblGrid>
-      <w:tr>
-        <w:tc>
-          <w:tcPr>
-            <w:tcW w:type="dxa" w:w="9026"/>
-            <w:shd w:fill="E9FBF0" w:val="clear"/>
-            <w:tcMar>
-              <w:top w:type="dxa" w:w="90"/>
-              <w:left w:type="dxa" w:w="160"/>
-              <w:bottom w:type="dxa" w:w="90"/>
-              <w:right w:type="dxa" w:w="160"/>
-            </w:tcMar>
-          </w:tcPr>
-          <w:p>
-            <w:pPr>
-              <w:spacing w:after="0" w:line="264"/>
-            </w:pPr>
-            <w:r>
-              <w:rPr>
-                <w:b/>
-                <w:bCs/>
-                <w:caps/>
-                <w:color w:val="047857"/>
-                <w:sz w:val="18"/>
-                <w:szCs w:val="18"/>
-              </w:rPr>
-              <w:t xml:space="preserve">📷 Insert screenshot — e2e output  </w:t>
+              <w:t xml:space="preserve">📷 Capture — e2e output  </w:t>
             </w:r>
             <w:r>
               <w:rPr>

</xml_diff>